<commit_message>
Correccion 05 - Terminando OK hasta Caggiano
</commit_message>
<xml_diff>
--- a/Practicos/Notas y Devoluciones 05.docx
+++ b/Practicos/Notas y Devoluciones 05.docx
@@ -1,6 +1,6 @@
 
 <file path=word/document.xml><?xml version="1.0" encoding="utf-8"?>
-<w:document xmlns:wpc="http://schemas.microsoft.com/office/word/2010/wordprocessingCanvas" xmlns:cx="http://schemas.microsoft.com/office/drawing/2014/chartex" xmlns:cx1="http://schemas.microsoft.com/office/drawing/2015/9/8/chartex" xmlns:cx2="http://schemas.microsoft.com/office/drawing/2015/10/21/chartex" xmlns:cx3="http://schemas.microsoft.com/office/drawing/2016/5/9/chartex" xmlns:cx4="http://schemas.microsoft.com/office/drawing/2016/5/10/chartex" xmlns:cx5="http://schemas.microsoft.com/office/drawing/2016/5/11/chartex" xmlns:cx6="http://schemas.microsoft.com/office/drawing/2016/5/12/chartex" xmlns:cx7="http://schemas.microsoft.com/office/drawing/2016/5/13/chartex" xmlns:cx8="http://schemas.microsoft.com/office/drawing/2016/5/14/chartex" xmlns:mc="http://schemas.openxmlformats.org/markup-compatibility/2006" xmlns:aink="http://schemas.microsoft.com/office/drawing/2016/ink" xmlns:am3d="http://schemas.microsoft.com/office/drawing/2017/model3d" xmlns:o="urn:schemas-microsoft-com:office:office" xmlns:oel="http://schemas.microsoft.com/office/2019/extlst" xmlns:r="http://schemas.openxmlformats.org/officeDocument/2006/relationships" xmlns:m="http://schemas.openxmlformats.org/officeDocument/2006/math" xmlns:v="urn:schemas-microsoft-com:vml" xmlns:wp14="http://schemas.microsoft.com/office/word/2010/wordprocessingDrawing" xmlns:wp="http://schemas.openxmlformats.org/drawingml/2006/wordprocessingDrawing" xmlns:w10="urn:schemas-microsoft-com:office:word" xmlns:w="http://schemas.openxmlformats.org/wordprocessingml/2006/main" xmlns:w14="http://schemas.microsoft.com/office/word/2010/wordml" xmlns:w15="http://schemas.microsoft.com/office/word/2012/wordml" xmlns:w16cex="http://schemas.microsoft.com/office/word/2018/wordml/cex" xmlns:w16cid="http://schemas.microsoft.com/office/word/2016/wordml/cid" xmlns:w16="http://schemas.microsoft.com/office/word/2018/wordml" xmlns:w16du="http://schemas.microsoft.com/office/word/2023/wordml/word16du" xmlns:w16sdtdh="http://schemas.microsoft.com/office/word/2020/wordml/sdtdatahash" xmlns:w16sdtfl="http://schemas.microsoft.com/office/word/2024/wordml/sdtformatlock" xmlns:w16se="http://schemas.microsoft.com/office/word/2015/wordml/symex" xmlns:wpg="http://schemas.microsoft.com/office/word/2010/wordprocessingGroup" xmlns:wpi="http://schemas.microsoft.com/office/word/2010/wordprocessingInk" xmlns:wne="http://schemas.microsoft.com/office/word/2006/wordml" xmlns:wps="http://schemas.microsoft.com/office/word/2010/wordprocessingShape" mc:Ignorable="w14 w15 w16se w16cid w16 w16cex w16sdtdh w16sdtfl w16du wp14">
+<w:document xmlns:wpc="http://schemas.microsoft.com/office/word/2010/wordprocessingCanvas" xmlns:cx="http://schemas.microsoft.com/office/drawing/2014/chartex" xmlns:cx1="http://schemas.microsoft.com/office/drawing/2015/9/8/chartex" xmlns:cx2="http://schemas.microsoft.com/office/drawing/2015/10/21/chartex" xmlns:cx3="http://schemas.microsoft.com/office/drawing/2016/5/9/chartex" xmlns:cx4="http://schemas.microsoft.com/office/drawing/2016/5/10/chartex" xmlns:cx5="http://schemas.microsoft.com/office/drawing/2016/5/11/chartex" xmlns:cx6="http://schemas.microsoft.com/office/drawing/2016/5/12/chartex" xmlns:cx7="http://schemas.microsoft.com/office/drawing/2016/5/13/chartex" xmlns:cx8="http://schemas.microsoft.com/office/drawing/2016/5/14/chartex" xmlns:mc="http://schemas.openxmlformats.org/markup-compatibility/2006" xmlns:aink="http://schemas.microsoft.com/office/drawing/2016/ink" xmlns:am3d="http://schemas.microsoft.com/office/drawing/2017/model3d" xmlns:o="urn:schemas-microsoft-com:office:office" xmlns:oel="http://schemas.microsoft.com/office/2019/extlst" xmlns:r="http://schemas.openxmlformats.org/officeDocument/2006/relationships" xmlns:m="http://schemas.openxmlformats.org/officeDocument/2006/math" xmlns:v="urn:schemas-microsoft-com:vml" xmlns:wp14="http://schemas.microsoft.com/office/word/2010/wordprocessingDrawing" xmlns:wp="http://schemas.openxmlformats.org/drawingml/2006/wordprocessingDrawing" xmlns:w10="urn:schemas-microsoft-com:office:word" xmlns:w="http://schemas.openxmlformats.org/wordprocessingml/2006/main" xmlns:w14="http://schemas.microsoft.com/office/word/2010/wordml" xmlns:w15="http://schemas.microsoft.com/office/word/2012/wordml" xmlns:w16cex="http://schemas.microsoft.com/office/word/2018/wordml/cex" xmlns:w16cid="http://schemas.microsoft.com/office/word/2016/wordml/cid" xmlns:w16="http://schemas.microsoft.com/office/word/2018/wordml" xmlns:w16sdtdh="http://schemas.microsoft.com/office/word/2020/wordml/sdtdatahash" xmlns:w16se="http://schemas.microsoft.com/office/word/2015/wordml/symex" xmlns:wpg="http://schemas.microsoft.com/office/word/2010/wordprocessingGroup" xmlns:wpi="http://schemas.microsoft.com/office/word/2010/wordprocessingInk" xmlns:wne="http://schemas.microsoft.com/office/word/2006/wordml" xmlns:wps="http://schemas.microsoft.com/office/word/2010/wordprocessingShape" mc:Ignorable="w14 w15 w16se w16cid w16 w16cex w16sdtdh wp14">
   <w:body>
     <w:p>
       <w:pPr>
@@ -31,7 +31,6 @@
     </w:p>
     <w:p>
       <w:pPr>
-        <w:ind w:left="708" w:hanging="708"/>
         <w:rPr>
           <w:rFonts w:ascii="Segoe UI Emoji" w:hAnsi="Segoe UI Emoji" w:cs="Segoe UI Emoji"/>
         </w:rPr>
@@ -48,7 +47,7 @@
       </w:r>
       <w:proofErr w:type="gramEnd"/>
       <w:r>
-        <w:t xml:space="preserve">Felicitaciones por la entrega del Desafío 04! </w:t>
+        <w:t xml:space="preserve">Felicitaciones por la entrega del Desafío 05! </w:t>
       </w:r>
       <w:r>
         <w:rPr>
@@ -60,65 +59,94 @@
     <w:p/>
     <w:p>
       <w:r>
-        <w:t>Facundo, excelente trabajo, te felicito. Destaco la prolijidad de tu proyecto.</w:t>
-      </w:r>
-    </w:p>
-    <w:p/>
-    <w:p>
-      <w:r>
-        <w:t xml:space="preserve">La estructura HTML esta impecable, destaco la correcta implementación de contenedores semánticos como </w:t>
-      </w:r>
-      <w:proofErr w:type="spellStart"/>
-      <w:r>
-        <w:t>main</w:t>
-      </w:r>
-      <w:proofErr w:type="spellEnd"/>
-      <w:r>
-        <w:t xml:space="preserve">, </w:t>
-      </w:r>
-      <w:proofErr w:type="spellStart"/>
-      <w:r>
-        <w:t>section</w:t>
-      </w:r>
-      <w:proofErr w:type="spellEnd"/>
-      <w:r>
-        <w:t xml:space="preserve">, </w:t>
-      </w:r>
-      <w:proofErr w:type="spellStart"/>
-      <w:r>
-        <w:t>footer</w:t>
-      </w:r>
-      <w:proofErr w:type="spellEnd"/>
-      <w:r>
-        <w:t>, etc.</w:t>
-      </w:r>
-    </w:p>
-    <w:p/>
-    <w:p>
-      <w:r>
-        <w:t xml:space="preserve">La implementación de position para superponer el banner quedo perfecto. </w:t>
-      </w:r>
-    </w:p>
-    <w:p/>
-    <w:p>
-      <w:r>
-        <w:t xml:space="preserve">La disposición de elementos en la </w:t>
-      </w:r>
-      <w:proofErr w:type="spellStart"/>
-      <w:r>
-        <w:t>landing</w:t>
-      </w:r>
-      <w:proofErr w:type="spellEnd"/>
-      <w:r>
-        <w:t xml:space="preserve"> page quedo tal cual lo solicitado con la herramienta Flex.</w:t>
-      </w:r>
-    </w:p>
-    <w:p/>
-    <w:p>
-      <w:r>
-        <w:t>Correctamente creadas la tabla y recurso de video. Los estilos tal cual los solicitados en imágenes de referencia.</w:t>
-      </w:r>
-    </w:p>
+        <w:t>Facundo</w:t>
+      </w:r>
+      <w:r>
+        <w:t>, muy buen trabajo, te felicito</w:t>
+      </w:r>
+    </w:p>
+    <w:p/>
+    <w:p>
+      <w:r>
+        <w:t xml:space="preserve">La declaración y uso de variables </w:t>
+      </w:r>
+      <w:proofErr w:type="spellStart"/>
+      <w:r>
+        <w:t>let</w:t>
+      </w:r>
+      <w:proofErr w:type="spellEnd"/>
+      <w:r>
+        <w:t xml:space="preserve"> y </w:t>
+      </w:r>
+      <w:proofErr w:type="spellStart"/>
+      <w:r>
+        <w:t>const</w:t>
+      </w:r>
+      <w:proofErr w:type="spellEnd"/>
+      <w:r>
+        <w:t xml:space="preserve"> esta correcta</w:t>
+      </w:r>
+      <w:r>
+        <w:t xml:space="preserve">. </w:t>
+      </w:r>
+    </w:p>
+    <w:p/>
+    <w:p>
+      <w:r>
+        <w:t xml:space="preserve">Manipulaste correctamente los tipos de datos para cada situación y los nombres asignados a variables son descriptivos como se </w:t>
+      </w:r>
+      <w:proofErr w:type="spellStart"/>
+      <w:r>
+        <w:t>solicito</w:t>
+      </w:r>
+      <w:proofErr w:type="spellEnd"/>
+      <w:r>
+        <w:t>.</w:t>
+      </w:r>
+    </w:p>
+    <w:p/>
+    <w:p>
+      <w:r>
+        <w:t>Correcto el uso de operadores matemáticos y los resultados guardados en variables.</w:t>
+      </w:r>
+    </w:p>
+    <w:p/>
+    <w:p>
+      <w:r>
+        <w:t xml:space="preserve">Buenísimo que te manejaste con </w:t>
+      </w:r>
+      <w:proofErr w:type="spellStart"/>
+      <w:r>
+        <w:t>template</w:t>
+      </w:r>
+      <w:proofErr w:type="spellEnd"/>
+      <w:r>
+        <w:t xml:space="preserve"> </w:t>
+      </w:r>
+      <w:proofErr w:type="spellStart"/>
+      <w:r>
+        <w:t>literals</w:t>
+      </w:r>
+      <w:proofErr w:type="spellEnd"/>
+      <w:r>
+        <w:t xml:space="preserve"> en lugar de concatenar </w:t>
+      </w:r>
+      <w:proofErr w:type="spellStart"/>
+      <w:r>
+        <w:t>strings</w:t>
+      </w:r>
+      <w:proofErr w:type="spellEnd"/>
+      <w:r>
+        <w:t>.</w:t>
+      </w:r>
+    </w:p>
+    <w:p/>
+    <w:p>
+      <w:r>
+        <w:t>Quiero destacar la prolijidad de tu código.</w:t>
+      </w:r>
+    </w:p>
+    <w:p/>
     <w:p/>
     <w:p/>
     <w:p>
@@ -129,13 +157,7 @@
     <w:p/>
     <w:p>
       <w:r>
-        <w:t>Tu nota en el Desafío 0</w:t>
-      </w:r>
-      <w:r>
-        <w:t>4</w:t>
-      </w:r>
-      <w:r>
-        <w:t xml:space="preserve"> es: </w:t>
+        <w:t xml:space="preserve">Tu nota en el Desafío 05 es: </w:t>
       </w:r>
       <w:r>
         <w:rPr>
@@ -200,8 +222,18 @@
           <w:b/>
           <w:bCs/>
         </w:rPr>
-        <w:t xml:space="preserve"> Diego Gaston</w:t>
-      </w:r>
+        <w:t xml:space="preserve"> Diego </w:t>
+      </w:r>
+      <w:proofErr w:type="spellStart"/>
+      <w:r>
+        <w:rPr>
+          <w:rFonts w:ascii="Segoe UI Emoji" w:hAnsi="Segoe UI Emoji" w:cs="Segoe UI Emoji"/>
+          <w:b/>
+          <w:bCs/>
+        </w:rPr>
+        <w:t>Gaston</w:t>
+      </w:r>
+      <w:proofErr w:type="spellEnd"/>
     </w:p>
     <w:p>
       <w:pPr>
@@ -230,7 +262,7 @@
       </w:r>
       <w:proofErr w:type="gramEnd"/>
       <w:r>
-        <w:t xml:space="preserve">Felicitaciones por la entrega del Desafío 04! </w:t>
+        <w:t xml:space="preserve">Felicitaciones por la entrega del Desafío 05! </w:t>
       </w:r>
       <w:r>
         <w:rPr>
@@ -242,81 +274,118 @@
     <w:p/>
     <w:p>
       <w:r>
-        <w:t>Diego, muy buen trabajo, te felicito. Destaco la prolijidad de tu proyecto.</w:t>
-      </w:r>
-    </w:p>
-    <w:p/>
-    <w:p>
-      <w:r>
-        <w:t xml:space="preserve">En la estructura HTML solo falto contener la </w:t>
-      </w:r>
-      <w:proofErr w:type="spellStart"/>
-      <w:r>
-        <w:t>info</w:t>
-      </w:r>
-      <w:proofErr w:type="spellEnd"/>
-      <w:r>
-        <w:t xml:space="preserve"> principal en la etiqueta &lt;</w:t>
-      </w:r>
-      <w:proofErr w:type="spellStart"/>
-      <w:r>
-        <w:t>main</w:t>
-      </w:r>
-      <w:proofErr w:type="spellEnd"/>
-      <w:r>
-        <w:t xml:space="preserve">&gt;, luego es correcta la implementación de contenedores semánticos como </w:t>
-      </w:r>
-      <w:proofErr w:type="spellStart"/>
-      <w:r>
-        <w:t>header</w:t>
-      </w:r>
-      <w:proofErr w:type="spellEnd"/>
+        <w:t>Diego</w:t>
+      </w:r>
       <w:r>
         <w:t xml:space="preserve">, </w:t>
       </w:r>
-      <w:proofErr w:type="spellStart"/>
-      <w:r>
-        <w:t>section</w:t>
-      </w:r>
-      <w:proofErr w:type="spellEnd"/>
-      <w:r>
-        <w:t xml:space="preserve">, </w:t>
-      </w:r>
-      <w:proofErr w:type="spellStart"/>
-      <w:r>
-        <w:t>footer</w:t>
-      </w:r>
-      <w:proofErr w:type="spellEnd"/>
-      <w:r>
-        <w:t>, etc.</w:t>
-      </w:r>
-    </w:p>
-    <w:p/>
-    <w:p>
-      <w:r>
-        <w:t xml:space="preserve">La implementación de position para superponer el banner quedo perfecto. </w:t>
-      </w:r>
-    </w:p>
-    <w:p/>
-    <w:p>
-      <w:r>
-        <w:t xml:space="preserve">La disposición de elementos en la </w:t>
-      </w:r>
-      <w:proofErr w:type="spellStart"/>
-      <w:r>
-        <w:t>landing</w:t>
-      </w:r>
-      <w:proofErr w:type="spellEnd"/>
-      <w:r>
-        <w:t xml:space="preserve"> page quedo tal cual lo solicitado con la herramienta Flex.</w:t>
-      </w:r>
-    </w:p>
-    <w:p/>
-    <w:p>
-      <w:r>
-        <w:t>Correctamente creadas la tabla y recurso de video. Los estilos tal cual los solicitados en imágenes de referencia.</w:t>
-      </w:r>
-    </w:p>
+      <w:r>
+        <w:t>excelente</w:t>
+      </w:r>
+      <w:r>
+        <w:t xml:space="preserve"> trabajo, te felicito</w:t>
+      </w:r>
+      <w:r>
+        <w:t xml:space="preserve"> por el resultado logrado.</w:t>
+      </w:r>
+    </w:p>
+    <w:p/>
+    <w:p>
+      <w:r>
+        <w:lastRenderedPageBreak/>
+        <w:t xml:space="preserve">La declaración y uso de variables </w:t>
+      </w:r>
+      <w:proofErr w:type="spellStart"/>
+      <w:r>
+        <w:t>let</w:t>
+      </w:r>
+      <w:proofErr w:type="spellEnd"/>
+      <w:r>
+        <w:t xml:space="preserve"> y </w:t>
+      </w:r>
+      <w:proofErr w:type="spellStart"/>
+      <w:r>
+        <w:t>const</w:t>
+      </w:r>
+      <w:proofErr w:type="spellEnd"/>
+      <w:r>
+        <w:t xml:space="preserve"> esta </w:t>
+      </w:r>
+      <w:r>
+        <w:t xml:space="preserve">impecable, destaco que supiste cuando utilizar variables </w:t>
+      </w:r>
+      <w:proofErr w:type="spellStart"/>
+      <w:r>
+        <w:t>const</w:t>
+      </w:r>
+      <w:proofErr w:type="spellEnd"/>
+      <w:r>
+        <w:t>, como pro ejemplo con datos como el “</w:t>
+      </w:r>
+      <w:proofErr w:type="spellStart"/>
+      <w:r>
+        <w:t>iva</w:t>
+      </w:r>
+      <w:proofErr w:type="spellEnd"/>
+      <w:r>
+        <w:t>” que son valores que no cambian a lo largo del documento.</w:t>
+      </w:r>
+    </w:p>
+    <w:p/>
+    <w:p>
+      <w:r>
+        <w:t xml:space="preserve">Manipulaste correctamente los tipos de datos para cada situación y los nombres asignados a variables son descriptivos como se </w:t>
+      </w:r>
+      <w:r>
+        <w:t>solicitó</w:t>
+      </w:r>
+      <w:r>
+        <w:t>.</w:t>
+      </w:r>
+    </w:p>
+    <w:p/>
+    <w:p>
+      <w:r>
+        <w:t>Correcto el uso de operadores matemáticos y los resultados guardados en variables.</w:t>
+      </w:r>
+    </w:p>
+    <w:p/>
+    <w:p>
+      <w:r>
+        <w:t xml:space="preserve">Buenísimo que te manejaste con </w:t>
+      </w:r>
+      <w:proofErr w:type="spellStart"/>
+      <w:r>
+        <w:t>template</w:t>
+      </w:r>
+      <w:proofErr w:type="spellEnd"/>
+      <w:r>
+        <w:t xml:space="preserve"> </w:t>
+      </w:r>
+      <w:proofErr w:type="spellStart"/>
+      <w:r>
+        <w:t>literals</w:t>
+      </w:r>
+      <w:proofErr w:type="spellEnd"/>
+      <w:r>
+        <w:t xml:space="preserve"> en lugar de concatenar </w:t>
+      </w:r>
+      <w:proofErr w:type="spellStart"/>
+      <w:r>
+        <w:t>strings</w:t>
+      </w:r>
+      <w:proofErr w:type="spellEnd"/>
+      <w:r>
+        <w:t>.</w:t>
+      </w:r>
+    </w:p>
+    <w:p/>
+    <w:p>
+      <w:r>
+        <w:t>Quiero destacar la prolijidad de tu código.</w:t>
+      </w:r>
+    </w:p>
+    <w:p/>
     <w:p/>
     <w:p/>
     <w:p>
@@ -327,7 +396,7 @@
     <w:p/>
     <w:p>
       <w:r>
-        <w:t xml:space="preserve">Tu nota en el Desafío 04 es: </w:t>
+        <w:t xml:space="preserve">Tu nota en el Desafío 05 es: </w:t>
       </w:r>
       <w:r>
         <w:rPr>
@@ -390,7 +459,7 @@
       </w:r>
       <w:proofErr w:type="gramEnd"/>
       <w:r>
-        <w:t xml:space="preserve">Felicitaciones por la entrega del Desafío 04! </w:t>
+        <w:t xml:space="preserve">Felicitaciones por la entrega del Desafío 05! </w:t>
       </w:r>
       <w:r>
         <w:rPr>
@@ -401,85 +470,126 @@
     </w:p>
     <w:p/>
     <w:p>
-      <w:r>
-        <w:t>Agustin, excelente trabajo, te felicito. Destaco la prolijidad de tu proyecto.</w:t>
-      </w:r>
-    </w:p>
-    <w:p/>
-    <w:p>
-      <w:r>
-        <w:t xml:space="preserve">La estructura HTML esta impecable, destaco la correcta implementación de contenedores semánticos como </w:t>
-      </w:r>
-      <w:proofErr w:type="spellStart"/>
-      <w:r>
-        <w:t>main</w:t>
-      </w:r>
-      <w:proofErr w:type="spellEnd"/>
-      <w:r>
-        <w:t xml:space="preserve">, </w:t>
-      </w:r>
-      <w:proofErr w:type="spellStart"/>
-      <w:r>
-        <w:t>section</w:t>
-      </w:r>
-      <w:proofErr w:type="spellEnd"/>
-      <w:r>
-        <w:t xml:space="preserve">, </w:t>
-      </w:r>
-      <w:proofErr w:type="spellStart"/>
-      <w:r>
-        <w:t>footer</w:t>
-      </w:r>
-      <w:proofErr w:type="spellEnd"/>
-      <w:r>
-        <w:t>, etc.</w:t>
-      </w:r>
-    </w:p>
-    <w:p/>
-    <w:p>
-      <w:r>
-        <w:t xml:space="preserve">La implementación de position para superponer el banner quedo perfecto. </w:t>
-      </w:r>
-    </w:p>
-    <w:p/>
-    <w:p>
-      <w:r>
-        <w:t xml:space="preserve">La disposición de elementos en la </w:t>
-      </w:r>
-      <w:proofErr w:type="spellStart"/>
-      <w:r>
-        <w:t>landing</w:t>
-      </w:r>
-      <w:proofErr w:type="spellEnd"/>
-      <w:r>
-        <w:t xml:space="preserve"> page quedo tal cual lo solicitado con la herramienta Flex.</w:t>
-      </w:r>
-    </w:p>
-    <w:p/>
-    <w:p>
-      <w:r>
-        <w:t>Correctamente creadas la tabla y recurso de video. Los estilos tal cual los solicitados en imágenes de referencia.</w:t>
-      </w:r>
-    </w:p>
-    <w:p/>
-    <w:p/>
-    <w:p>
-      <w:r>
-        <w:lastRenderedPageBreak/>
+      <w:proofErr w:type="spellStart"/>
+      <w:r>
+        <w:t>Agustin</w:t>
+      </w:r>
+      <w:proofErr w:type="spellEnd"/>
+      <w:r>
+        <w:t>, muy buen trabajo, te felicito</w:t>
+      </w:r>
+      <w:r>
+        <w:t xml:space="preserve"> por el compromiso en realizar las entregas.</w:t>
+      </w:r>
+    </w:p>
+    <w:p/>
+    <w:p>
+      <w:r>
+        <w:t xml:space="preserve">La declaración y uso de variables </w:t>
+      </w:r>
+      <w:proofErr w:type="spellStart"/>
+      <w:r>
+        <w:t>let</w:t>
+      </w:r>
+      <w:proofErr w:type="spellEnd"/>
+      <w:r>
+        <w:t xml:space="preserve"> y </w:t>
+      </w:r>
+      <w:proofErr w:type="spellStart"/>
+      <w:r>
+        <w:t>const</w:t>
+      </w:r>
+      <w:proofErr w:type="spellEnd"/>
+      <w:r>
+        <w:t xml:space="preserve"> esta correcta</w:t>
+      </w:r>
+      <w:r>
+        <w:t xml:space="preserve">. Lastima no pudiste realizar el ejercicio </w:t>
+      </w:r>
+      <w:proofErr w:type="spellStart"/>
+      <w:r>
+        <w:t>nro</w:t>
+      </w:r>
+      <w:proofErr w:type="spellEnd"/>
+      <w:r>
+        <w:t xml:space="preserve"> 8.</w:t>
+      </w:r>
+    </w:p>
+    <w:p/>
+    <w:p>
+      <w:r>
+        <w:t xml:space="preserve">Manipulaste correctamente los tipos de datos para cada situación y los nombres asignados a variables son descriptivos como se </w:t>
+      </w:r>
+      <w:proofErr w:type="spellStart"/>
+      <w:r>
+        <w:t>solicito</w:t>
+      </w:r>
+      <w:proofErr w:type="spellEnd"/>
+      <w:r>
+        <w:t>.</w:t>
+      </w:r>
+    </w:p>
+    <w:p/>
+    <w:p>
+      <w:r>
+        <w:t>Correcto el uso de operadores matemáticos y los resultados guardados en variables.</w:t>
+      </w:r>
+    </w:p>
+    <w:p/>
+    <w:p>
+      <w:r>
+        <w:t xml:space="preserve">Buenísimo que te manejaste con </w:t>
+      </w:r>
+      <w:proofErr w:type="spellStart"/>
+      <w:r>
+        <w:t>template</w:t>
+      </w:r>
+      <w:proofErr w:type="spellEnd"/>
+      <w:r>
+        <w:t xml:space="preserve"> </w:t>
+      </w:r>
+      <w:proofErr w:type="spellStart"/>
+      <w:r>
+        <w:t>literals</w:t>
+      </w:r>
+      <w:proofErr w:type="spellEnd"/>
+      <w:r>
+        <w:t xml:space="preserve"> en lugar de concatenar </w:t>
+      </w:r>
+      <w:proofErr w:type="spellStart"/>
+      <w:r>
+        <w:t>strings</w:t>
+      </w:r>
+      <w:proofErr w:type="spellEnd"/>
+      <w:r>
+        <w:t>.</w:t>
+      </w:r>
+    </w:p>
+    <w:p/>
+    <w:p>
+      <w:r>
+        <w:t>Quiero destacar la prolijidad de tu código.</w:t>
+      </w:r>
+    </w:p>
+    <w:p/>
+    <w:p/>
+    <w:p/>
+    <w:p>
+      <w:r>
         <w:t>Excelente trabajo ¡</w:t>
       </w:r>
     </w:p>
     <w:p/>
     <w:p>
       <w:r>
-        <w:t xml:space="preserve">Tu nota en el Desafío 04 es: </w:t>
-      </w:r>
-      <w:r>
-        <w:rPr>
-          <w:b/>
-          <w:bCs/>
-        </w:rPr>
-        <w:t>10</w:t>
+        <w:t xml:space="preserve">Tu nota en el Desafío 05 es: </w:t>
+      </w:r>
+      <w:r>
+        <w:rPr>
+          <w:b/>
+          <w:bCs/>
+        </w:rPr>
+        <w:t>9</w:t>
       </w:r>
     </w:p>
     <w:p>
@@ -557,7 +667,7 @@
       </w:r>
       <w:proofErr w:type="gramEnd"/>
       <w:r>
-        <w:t xml:space="preserve">Felicitaciones por la entrega del Desafío 04! </w:t>
+        <w:t xml:space="preserve">Felicitaciones por la entrega del Desafío 05! </w:t>
       </w:r>
       <w:r>
         <w:rPr>
@@ -572,65 +682,96 @@
         <w:t>Santiago</w:t>
       </w:r>
       <w:r>
-        <w:t>, excelente trabajo, te felicito. Destaco la prolijidad de tu proyecto.</w:t>
-      </w:r>
-    </w:p>
-    <w:p/>
-    <w:p>
-      <w:r>
-        <w:t xml:space="preserve">La estructura HTML esta impecable, destaco la correcta implementación de contenedores semánticos como </w:t>
-      </w:r>
-      <w:proofErr w:type="spellStart"/>
-      <w:r>
-        <w:t>main</w:t>
-      </w:r>
-      <w:proofErr w:type="spellEnd"/>
-      <w:r>
-        <w:t xml:space="preserve">, </w:t>
-      </w:r>
-      <w:proofErr w:type="spellStart"/>
-      <w:r>
-        <w:t>section</w:t>
-      </w:r>
-      <w:proofErr w:type="spellEnd"/>
-      <w:r>
-        <w:t xml:space="preserve">, </w:t>
-      </w:r>
-      <w:proofErr w:type="spellStart"/>
-      <w:r>
-        <w:t>footer</w:t>
-      </w:r>
-      <w:proofErr w:type="spellEnd"/>
-      <w:r>
-        <w:t>, etc.</w:t>
-      </w:r>
-    </w:p>
-    <w:p/>
-    <w:p>
-      <w:r>
-        <w:t xml:space="preserve">La implementación de position para superponer el banner quedo perfecto. </w:t>
-      </w:r>
-    </w:p>
-    <w:p/>
-    <w:p>
-      <w:r>
-        <w:t xml:space="preserve">La disposición de elementos en la </w:t>
-      </w:r>
-      <w:proofErr w:type="spellStart"/>
-      <w:r>
-        <w:t>landing</w:t>
-      </w:r>
-      <w:proofErr w:type="spellEnd"/>
-      <w:r>
-        <w:t xml:space="preserve"> page quedo tal cual lo solicitado con la herramienta Flex.</w:t>
-      </w:r>
-    </w:p>
-    <w:p/>
-    <w:p>
-      <w:r>
-        <w:t>Correctamente creadas la tabla y recurso de video. Los estilos tal cual los solicitados en imágenes de referencia.</w:t>
-      </w:r>
-    </w:p>
+        <w:t>, muy buen trabajo, te felicito</w:t>
+      </w:r>
+      <w:r>
+        <w:t xml:space="preserve"> por el compromiso en realizar las entregas.</w:t>
+      </w:r>
+    </w:p>
+    <w:p/>
+    <w:p>
+      <w:r>
+        <w:t xml:space="preserve">La declaración y uso de variables </w:t>
+      </w:r>
+      <w:proofErr w:type="spellStart"/>
+      <w:r>
+        <w:t>let</w:t>
+      </w:r>
+      <w:proofErr w:type="spellEnd"/>
+      <w:r>
+        <w:t xml:space="preserve"> y </w:t>
+      </w:r>
+      <w:proofErr w:type="spellStart"/>
+      <w:r>
+        <w:t>const</w:t>
+      </w:r>
+      <w:proofErr w:type="spellEnd"/>
+      <w:r>
+        <w:t xml:space="preserve"> esta correcta</w:t>
+      </w:r>
+      <w:r>
+        <w:t>.</w:t>
+      </w:r>
+    </w:p>
+    <w:p/>
+    <w:p>
+      <w:r>
+        <w:t xml:space="preserve">Manipulaste correctamente los tipos de datos para cada situación y los nombres asignados a variables son descriptivos como se </w:t>
+      </w:r>
+      <w:proofErr w:type="spellStart"/>
+      <w:r>
+        <w:t>solicito</w:t>
+      </w:r>
+      <w:proofErr w:type="spellEnd"/>
+      <w:r>
+        <w:t>.</w:t>
+      </w:r>
+    </w:p>
+    <w:p/>
+    <w:p>
+      <w:r>
+        <w:t>Correcto el uso de operadores matemáticos y los resultados guardados en variables.</w:t>
+      </w:r>
+    </w:p>
+    <w:p/>
+    <w:p>
+      <w:r>
+        <w:t xml:space="preserve">Buenísimo que te manejaste con </w:t>
+      </w:r>
+      <w:proofErr w:type="spellStart"/>
+      <w:r>
+        <w:t>template</w:t>
+      </w:r>
+      <w:proofErr w:type="spellEnd"/>
+      <w:r>
+        <w:t xml:space="preserve"> </w:t>
+      </w:r>
+      <w:proofErr w:type="spellStart"/>
+      <w:r>
+        <w:t>literals</w:t>
+      </w:r>
+      <w:proofErr w:type="spellEnd"/>
+      <w:r>
+        <w:t xml:space="preserve"> en lugar de concatenar </w:t>
+      </w:r>
+      <w:proofErr w:type="spellStart"/>
+      <w:r>
+        <w:t>strings</w:t>
+      </w:r>
+      <w:proofErr w:type="spellEnd"/>
+      <w:r>
+        <w:t>.</w:t>
+      </w:r>
+    </w:p>
+    <w:p/>
+    <w:p>
+      <w:r>
+        <w:t>Quiero destacar la prolijidad de tu código.</w:t>
+      </w:r>
+    </w:p>
+    <w:p/>
+    <w:p/>
+    <w:p/>
     <w:p/>
     <w:p/>
     <w:p>
@@ -641,7 +782,7 @@
     <w:p/>
     <w:p>
       <w:r>
-        <w:t xml:space="preserve">Tu nota en el Desafío 04 es: </w:t>
+        <w:t xml:space="preserve">Tu nota en el Desafío 05 es: </w:t>
       </w:r>
       <w:r>
         <w:rPr>
@@ -711,7 +852,6 @@
         <w:rPr>
           <w:rFonts w:ascii="Segoe UI Emoji" w:hAnsi="Segoe UI Emoji" w:cs="Segoe UI Emoji"/>
         </w:rPr>
-        <w:lastRenderedPageBreak/>
         <w:t>🎉</w:t>
       </w:r>
       <w:r>
@@ -719,13 +859,7 @@
       </w:r>
       <w:proofErr w:type="gramEnd"/>
       <w:r>
-        <w:t>Felicitaciones por la entrega del Desafío 0</w:t>
-      </w:r>
-      <w:r>
-        <w:t>4</w:t>
-      </w:r>
-      <w:r>
-        <w:t xml:space="preserve">! </w:t>
+        <w:t xml:space="preserve">Felicitaciones por la entrega del Desafío 05! </w:t>
       </w:r>
       <w:r>
         <w:rPr>
@@ -736,104 +870,145 @@
     </w:p>
     <w:p/>
     <w:p>
-      <w:r>
-        <w:t xml:space="preserve">Belen, </w:t>
-      </w:r>
-      <w:r>
-        <w:t>excelente trabajo, te felicito.</w:t>
-      </w:r>
+      <w:proofErr w:type="spellStart"/>
+      <w:r>
+        <w:t>Belen</w:t>
+      </w:r>
+      <w:proofErr w:type="spellEnd"/>
+      <w:r>
+        <w:t>, muy buen trabajo, te felicito por el compromiso en realizar las entregas.</w:t>
+      </w:r>
+    </w:p>
+    <w:p/>
+    <w:p>
+      <w:r>
+        <w:t>La declaración y uso de variables “</w:t>
+      </w:r>
+      <w:proofErr w:type="spellStart"/>
+      <w:r>
+        <w:t>let</w:t>
+      </w:r>
+      <w:proofErr w:type="spellEnd"/>
+      <w:r>
+        <w:t>” y “</w:t>
+      </w:r>
+      <w:proofErr w:type="spellStart"/>
+      <w:r>
+        <w:t>const</w:t>
+      </w:r>
+      <w:proofErr w:type="spellEnd"/>
+      <w:r>
+        <w:t>” esta</w:t>
+      </w:r>
+      <w:r>
+        <w:t xml:space="preserve"> correcta, falto declarar variables con </w:t>
+      </w:r>
+      <w:proofErr w:type="spellStart"/>
+      <w:r>
+        <w:t>let</w:t>
+      </w:r>
+      <w:proofErr w:type="spellEnd"/>
+      <w:r>
+        <w:t xml:space="preserve"> en el documento</w:t>
+      </w:r>
+      <w:r>
+        <w:t xml:space="preserve">, si bien en estos ejercicios no </w:t>
+      </w:r>
+      <w:proofErr w:type="spellStart"/>
+      <w:r>
+        <w:t>esta</w:t>
+      </w:r>
+      <w:proofErr w:type="spellEnd"/>
+      <w:r>
+        <w:t xml:space="preserve"> mal usar </w:t>
+      </w:r>
+      <w:proofErr w:type="spellStart"/>
+      <w:r>
+        <w:t>const</w:t>
+      </w:r>
+      <w:proofErr w:type="spellEnd"/>
+      <w:r>
+        <w:t xml:space="preserve"> conceptualmente queda mejor usarlo </w:t>
+      </w:r>
+      <w:r>
+        <w:rPr>
+          <w:u w:val="single"/>
+        </w:rPr>
+        <w:t>para</w:t>
+      </w:r>
+      <w:r>
+        <w:t xml:space="preserve"> objetos como el “</w:t>
+      </w:r>
+      <w:proofErr w:type="spellStart"/>
+      <w:r>
+        <w:t>iva</w:t>
+      </w:r>
+      <w:proofErr w:type="spellEnd"/>
+      <w:r>
+        <w:t>” que son valores que sabemos que son permanentes.</w:t>
+      </w:r>
+    </w:p>
+    <w:p/>
+    <w:p>
+      <w:r>
+        <w:t xml:space="preserve">Manipulaste correctamente los tipos de datos para cada situación y los nombres asignados a variables son descriptivos como se </w:t>
+      </w:r>
+      <w:proofErr w:type="spellStart"/>
+      <w:r>
+        <w:t>solicito</w:t>
+      </w:r>
+      <w:proofErr w:type="spellEnd"/>
+      <w:r>
+        <w:t>.</w:t>
+      </w:r>
+    </w:p>
+    <w:p/>
+    <w:p>
+      <w:r>
+        <w:t>Correcto el uso de operadores matemáticos y los resultados guardados en variables.</w:t>
+      </w:r>
+    </w:p>
+    <w:p/>
+    <w:p>
+      <w:r>
+        <w:t xml:space="preserve">Correctamente implementado los </w:t>
+      </w:r>
+      <w:proofErr w:type="spellStart"/>
+      <w:r>
+        <w:t>template</w:t>
+      </w:r>
+      <w:proofErr w:type="spellEnd"/>
       <w:r>
         <w:t xml:space="preserve"> </w:t>
       </w:r>
-      <w:r>
-        <w:t>Destaco la prolijidad de tu proyecto.</w:t>
-      </w:r>
-    </w:p>
-    <w:p/>
-    <w:p>
-      <w:r>
-        <w:t xml:space="preserve">La estructura HTML esta impecable, destaco la correcta implementación de contenedores semánticos como </w:t>
-      </w:r>
-      <w:proofErr w:type="spellStart"/>
-      <w:r>
-        <w:t>main</w:t>
-      </w:r>
-      <w:proofErr w:type="spellEnd"/>
-      <w:r>
-        <w:t xml:space="preserve">, </w:t>
-      </w:r>
-      <w:proofErr w:type="spellStart"/>
-      <w:r>
-        <w:t>section</w:t>
-      </w:r>
-      <w:proofErr w:type="spellEnd"/>
-      <w:r>
-        <w:t xml:space="preserve">, </w:t>
-      </w:r>
-      <w:proofErr w:type="spellStart"/>
-      <w:r>
-        <w:t>footer</w:t>
-      </w:r>
-      <w:proofErr w:type="spellEnd"/>
-      <w:r>
-        <w:t>,</w:t>
-      </w:r>
-      <w:r>
-        <w:t xml:space="preserve"> etc.</w:t>
-      </w:r>
-    </w:p>
-    <w:p/>
-    <w:p>
-      <w:r>
-        <w:t xml:space="preserve">La implementación de </w:t>
-      </w:r>
-      <w:r>
-        <w:t>position para superponer el banner quedo perfecto.</w:t>
-      </w:r>
-      <w:r>
-        <w:t xml:space="preserve"> </w:t>
-      </w:r>
-    </w:p>
-    <w:p/>
-    <w:p>
-      <w:r>
-        <w:t xml:space="preserve">La disposición de elementos en la </w:t>
-      </w:r>
-      <w:proofErr w:type="spellStart"/>
-      <w:r>
-        <w:t>landing</w:t>
-      </w:r>
-      <w:proofErr w:type="spellEnd"/>
-      <w:r>
-        <w:t xml:space="preserve"> page quedo tal cual lo solicitado con la herramienta Flex.</w:t>
-      </w:r>
-    </w:p>
-    <w:p/>
-    <w:p>
-      <w:r>
-        <w:t>Correctamente creadas la tabla y recurso de video</w:t>
-      </w:r>
-      <w:r>
-        <w:t>. Los estilos tal cual los solicitados en imágenes de referencia.</w:t>
-      </w:r>
-    </w:p>
-    <w:p/>
-    <w:p/>
-    <w:p>
-      <w:r>
-        <w:t>Excelente trabajo ¡</w:t>
-      </w:r>
-    </w:p>
-    <w:p/>
-    <w:p>
-      <w:r>
-        <w:t>Tu nota en el Desafío 0</w:t>
-      </w:r>
-      <w:r>
-        <w:t>4</w:t>
-      </w:r>
-      <w:r>
-        <w:t xml:space="preserve"> es: </w:t>
+      <w:proofErr w:type="spellStart"/>
+      <w:r>
+        <w:t>strings</w:t>
+      </w:r>
+      <w:proofErr w:type="spellEnd"/>
+      <w:r>
+        <w:t>.</w:t>
+      </w:r>
+    </w:p>
+    <w:p/>
+    <w:p/>
+    <w:p>
+      <w:r>
+        <w:t>Quiero destacar la prolijidad de tu código.</w:t>
+      </w:r>
+    </w:p>
+    <w:p/>
+    <w:p/>
+    <w:p/>
+    <w:p>
+      <w:r>
+        <w:t>Muy buen trabajo ¡</w:t>
+      </w:r>
+    </w:p>
+    <w:p/>
+    <w:p>
+      <w:r>
+        <w:t xml:space="preserve">Tu nota en el Desafío 05 es: </w:t>
       </w:r>
       <w:r>
         <w:rPr>
@@ -1090,7 +1265,7 @@
       </w:r>
       <w:proofErr w:type="gramEnd"/>
       <w:r>
-        <w:t xml:space="preserve">Felicitaciones por la entrega del Desafío 04! </w:t>
+        <w:t xml:space="preserve">Felicitaciones por la entrega del Desafío 05! </w:t>
       </w:r>
       <w:r>
         <w:rPr>
@@ -1102,65 +1277,107 @@
     <w:p/>
     <w:p>
       <w:r>
-        <w:t xml:space="preserve">Carlos, excelente trabajo, te felicito. </w:t>
-      </w:r>
-    </w:p>
-    <w:p/>
-    <w:p>
-      <w:r>
-        <w:t xml:space="preserve">La estructura HTML esta impecable, destaco la correcta implementación de contenedores semánticos como </w:t>
-      </w:r>
-      <w:proofErr w:type="spellStart"/>
-      <w:r>
-        <w:t>main</w:t>
-      </w:r>
-      <w:proofErr w:type="spellEnd"/>
-      <w:r>
-        <w:t xml:space="preserve">, </w:t>
-      </w:r>
-      <w:proofErr w:type="spellStart"/>
-      <w:r>
-        <w:t>section</w:t>
-      </w:r>
-      <w:proofErr w:type="spellEnd"/>
-      <w:r>
-        <w:t xml:space="preserve">, </w:t>
-      </w:r>
-      <w:proofErr w:type="spellStart"/>
-      <w:r>
-        <w:t>footer</w:t>
-      </w:r>
-      <w:proofErr w:type="spellEnd"/>
-      <w:r>
-        <w:t>, etc.</w:t>
-      </w:r>
-    </w:p>
-    <w:p/>
-    <w:p>
-      <w:r>
-        <w:t xml:space="preserve">La implementación de position para superponer el banner quedo perfecto. </w:t>
-      </w:r>
-    </w:p>
-    <w:p/>
-    <w:p>
-      <w:r>
-        <w:t xml:space="preserve">La disposición de elementos en la </w:t>
-      </w:r>
-      <w:proofErr w:type="spellStart"/>
-      <w:r>
-        <w:t>landing</w:t>
-      </w:r>
-      <w:proofErr w:type="spellEnd"/>
-      <w:r>
-        <w:t xml:space="preserve"> page quedo tal cual lo solicitado con la herramienta Flex.</w:t>
-      </w:r>
-    </w:p>
-    <w:p/>
-    <w:p>
-      <w:r>
-        <w:t>Correctamente creadas la tabla y recurso de video. Los estilos tal cual los solicitados en imágenes de referencia.</w:t>
-      </w:r>
-    </w:p>
+        <w:t>Carlos</w:t>
+      </w:r>
+      <w:r>
+        <w:t>, muy buen trabajo, te felicito por el compromiso en realizar las entregas.</w:t>
+      </w:r>
+    </w:p>
+    <w:p/>
+    <w:p>
+      <w:r>
+        <w:t>En cuanto a la implementación de variables “</w:t>
+      </w:r>
+      <w:proofErr w:type="spellStart"/>
+      <w:r>
+        <w:t>let</w:t>
+      </w:r>
+      <w:proofErr w:type="spellEnd"/>
+      <w:r>
+        <w:t>” y “</w:t>
+      </w:r>
+      <w:proofErr w:type="spellStart"/>
+      <w:r>
+        <w:t>const</w:t>
+      </w:r>
+      <w:proofErr w:type="spellEnd"/>
+      <w:r>
+        <w:t>” falto aplicar variables “</w:t>
+      </w:r>
+      <w:proofErr w:type="spellStart"/>
+      <w:r>
+        <w:t>let</w:t>
+      </w:r>
+      <w:proofErr w:type="spellEnd"/>
+      <w:r>
+        <w:t>”, las variables “</w:t>
+      </w:r>
+      <w:proofErr w:type="spellStart"/>
+      <w:r>
+        <w:t>const</w:t>
+      </w:r>
+      <w:proofErr w:type="spellEnd"/>
+      <w:r>
+        <w:t>” conceptualmente en estos ejercicios son más para valores como el “</w:t>
+      </w:r>
+      <w:proofErr w:type="spellStart"/>
+      <w:r>
+        <w:t>iva</w:t>
+      </w:r>
+      <w:proofErr w:type="spellEnd"/>
+      <w:r>
+        <w:t>” que son objetos que quedan permanentes.</w:t>
+      </w:r>
+    </w:p>
+    <w:p/>
+    <w:p>
+      <w:r>
+        <w:t>Manipulaste correctamente los tipos de datos para cada situación y los nombres asignados a variables son descriptivos como se solicitó.</w:t>
+      </w:r>
+    </w:p>
+    <w:p/>
+    <w:p>
+      <w:r>
+        <w:t>Correcto el uso de operadores matemáticos y los resultados guardados en variables.</w:t>
+      </w:r>
+    </w:p>
+    <w:p/>
+    <w:p>
+      <w:r>
+        <w:t xml:space="preserve">Buenísimo que te manejaste con </w:t>
+      </w:r>
+      <w:proofErr w:type="spellStart"/>
+      <w:r>
+        <w:t>template</w:t>
+      </w:r>
+      <w:proofErr w:type="spellEnd"/>
+      <w:r>
+        <w:t xml:space="preserve"> </w:t>
+      </w:r>
+      <w:proofErr w:type="spellStart"/>
+      <w:r>
+        <w:t>literals</w:t>
+      </w:r>
+      <w:proofErr w:type="spellEnd"/>
+      <w:r>
+        <w:t xml:space="preserve"> en lugar de concatenar </w:t>
+      </w:r>
+      <w:proofErr w:type="spellStart"/>
+      <w:r>
+        <w:t>strings</w:t>
+      </w:r>
+      <w:proofErr w:type="spellEnd"/>
+      <w:r>
+        <w:t>.</w:t>
+      </w:r>
+    </w:p>
+    <w:p/>
+    <w:p>
+      <w:r>
+        <w:t>Quiero destacar la prolijidad de tu código.</w:t>
+      </w:r>
+    </w:p>
+    <w:p/>
     <w:p/>
     <w:p/>
     <w:p>
@@ -1171,7 +1388,7 @@
     <w:p/>
     <w:p>
       <w:r>
-        <w:t xml:space="preserve">Tu nota en el Desafío 04 es: </w:t>
+        <w:t xml:space="preserve">Tu nota en el Desafío 05 es: </w:t>
       </w:r>
       <w:r>
         <w:rPr>
@@ -1244,7 +1461,7 @@
       </w:r>
       <w:proofErr w:type="gramEnd"/>
       <w:r>
-        <w:t xml:space="preserve">Felicitaciones por la entrega del Desafío 04! </w:t>
+        <w:t xml:space="preserve">Felicitaciones por la entrega del Desafío 05! </w:t>
       </w:r>
       <w:r>
         <w:rPr>
@@ -1256,65 +1473,153 @@
     <w:p/>
     <w:p>
       <w:r>
-        <w:t>Gianluca, excelente trabajo, te felicito. Destaco la prolijidad de tu proyecto.</w:t>
-      </w:r>
-    </w:p>
-    <w:p/>
-    <w:p>
-      <w:r>
-        <w:t xml:space="preserve">La estructura HTML esta impecable, destaco la correcta implementación de contenedores semánticos como </w:t>
-      </w:r>
-      <w:proofErr w:type="spellStart"/>
-      <w:r>
-        <w:t>main</w:t>
-      </w:r>
-      <w:proofErr w:type="spellEnd"/>
+        <w:t>Gianluca</w:t>
+      </w:r>
       <w:r>
         <w:t xml:space="preserve">, </w:t>
       </w:r>
-      <w:proofErr w:type="spellStart"/>
-      <w:r>
-        <w:t>section</w:t>
-      </w:r>
-      <w:proofErr w:type="spellEnd"/>
-      <w:r>
-        <w:t xml:space="preserve">, </w:t>
-      </w:r>
-      <w:proofErr w:type="spellStart"/>
-      <w:r>
-        <w:t>footer</w:t>
-      </w:r>
-      <w:proofErr w:type="spellEnd"/>
-      <w:r>
-        <w:t>, etc.</w:t>
-      </w:r>
-    </w:p>
-    <w:p/>
-    <w:p>
-      <w:r>
-        <w:t xml:space="preserve">La implementación de position para superponer el banner quedo perfecto. </w:t>
-      </w:r>
-    </w:p>
-    <w:p/>
-    <w:p>
-      <w:r>
-        <w:t xml:space="preserve">La disposición de elementos en la </w:t>
-      </w:r>
-      <w:proofErr w:type="spellStart"/>
-      <w:r>
-        <w:t>landing</w:t>
-      </w:r>
-      <w:proofErr w:type="spellEnd"/>
-      <w:r>
-        <w:t xml:space="preserve"> page quedo tal cual lo solicitado con la herramienta Flex.</w:t>
-      </w:r>
-    </w:p>
-    <w:p/>
-    <w:p>
-      <w:r>
-        <w:t>Correctamente creadas la tabla y recurso de video. Los estilos tal cual los solicitados en imágenes de referencia.</w:t>
-      </w:r>
-    </w:p>
+      <w:r>
+        <w:t>excelente</w:t>
+      </w:r>
+      <w:r>
+        <w:t xml:space="preserve"> trabajo, te felicito</w:t>
+      </w:r>
+      <w:r>
+        <w:t>.</w:t>
+      </w:r>
+    </w:p>
+    <w:p/>
+    <w:p>
+      <w:r>
+        <w:lastRenderedPageBreak/>
+        <w:t xml:space="preserve">La declaración y uso de variables </w:t>
+      </w:r>
+      <w:r>
+        <w:t>“</w:t>
+      </w:r>
+      <w:proofErr w:type="spellStart"/>
+      <w:r>
+        <w:t>let</w:t>
+      </w:r>
+      <w:proofErr w:type="spellEnd"/>
+      <w:r>
+        <w:t>”</w:t>
+      </w:r>
+      <w:r>
+        <w:t xml:space="preserve"> y </w:t>
+      </w:r>
+      <w:r>
+        <w:t>“</w:t>
+      </w:r>
+      <w:proofErr w:type="spellStart"/>
+      <w:r>
+        <w:t>const</w:t>
+      </w:r>
+      <w:proofErr w:type="spellEnd"/>
+      <w:r>
+        <w:t>”</w:t>
+      </w:r>
+      <w:r>
+        <w:t xml:space="preserve"> </w:t>
+      </w:r>
+      <w:r>
+        <w:t>impecable, separaste correctamente cuando utilizar cada uno.</w:t>
+      </w:r>
+    </w:p>
+    <w:p>
+      <w:r>
+        <w:t xml:space="preserve">Manipulaste correctamente los tipos de datos para cada situación y los nombres asignados a variables son descriptivos como se </w:t>
+      </w:r>
+      <w:r>
+        <w:t>solicitó</w:t>
+      </w:r>
+      <w:r>
+        <w:t>.</w:t>
+      </w:r>
+    </w:p>
+    <w:p/>
+    <w:p>
+      <w:r>
+        <w:t>Correcto el uso de operadores matemáticos y los resultados guardados en variables.</w:t>
+      </w:r>
+      <w:r>
+        <w:t xml:space="preserve"> </w:t>
+      </w:r>
+      <w:proofErr w:type="spellStart"/>
+      <w:r>
+        <w:t>Aca</w:t>
+      </w:r>
+      <w:proofErr w:type="spellEnd"/>
+      <w:r>
+        <w:t xml:space="preserve"> en el ejercicio </w:t>
+      </w:r>
+      <w:proofErr w:type="spellStart"/>
+      <w:r>
+        <w:t>nro</w:t>
+      </w:r>
+      <w:proofErr w:type="spellEnd"/>
+      <w:r>
+        <w:t xml:space="preserve"> 2 falto describir mejor en consola que operación se esta realizando y recomiendo utilizar ${numero1 * numero2} para las expresiones lógicas, todo esto adentro </w:t>
+      </w:r>
+      <w:proofErr w:type="spellStart"/>
+      <w:r>
+        <w:t>backticks</w:t>
+      </w:r>
+      <w:proofErr w:type="spellEnd"/>
+      <w:r>
+        <w:t>.</w:t>
+      </w:r>
+    </w:p>
+    <w:p/>
+    <w:p>
+      <w:r>
+        <w:t xml:space="preserve">Buenísimo que te manejaste con </w:t>
+      </w:r>
+      <w:proofErr w:type="spellStart"/>
+      <w:r>
+        <w:t>template</w:t>
+      </w:r>
+      <w:proofErr w:type="spellEnd"/>
+      <w:r>
+        <w:t xml:space="preserve"> </w:t>
+      </w:r>
+      <w:proofErr w:type="spellStart"/>
+      <w:r>
+        <w:t>literals</w:t>
+      </w:r>
+      <w:proofErr w:type="spellEnd"/>
+      <w:r>
+        <w:t xml:space="preserve">. En los </w:t>
+      </w:r>
+      <w:proofErr w:type="spellStart"/>
+      <w:proofErr w:type="gramStart"/>
+      <w:r>
+        <w:t>alert</w:t>
+      </w:r>
+      <w:proofErr w:type="spellEnd"/>
+      <w:r>
+        <w:t>(</w:t>
+      </w:r>
+      <w:proofErr w:type="gramEnd"/>
+      <w:r>
+        <w:t xml:space="preserve">) de los ejercicios 9 y 10 podías usar un solo </w:t>
+      </w:r>
+      <w:proofErr w:type="spellStart"/>
+      <w:r>
+        <w:t>template</w:t>
+      </w:r>
+      <w:proofErr w:type="spellEnd"/>
+      <w:r>
+        <w:t xml:space="preserve"> literal en lugar de varios y concatenarlos.</w:t>
+      </w:r>
+    </w:p>
+    <w:p/>
+    <w:p>
+      <w:r>
+        <w:t>Quiero destacar la prolijidad de tu código.</w:t>
+      </w:r>
+    </w:p>
+    <w:p/>
     <w:p/>
     <w:p/>
     <w:p>
@@ -1324,8 +1629,13 @@
     </w:p>
     <w:p/>
     <w:p>
-      <w:r>
-        <w:t xml:space="preserve">Tu nota en el Desafío 04 es: </w:t>
+      <w:pPr>
+        <w:rPr>
+          <w:u w:val="single"/>
+        </w:rPr>
+      </w:pPr>
+      <w:r>
+        <w:t xml:space="preserve">Tu nota en el Desafío 05 es: </w:t>
       </w:r>
       <w:r>
         <w:rPr>
@@ -1397,7 +1707,7 @@
       </w:r>
       <w:proofErr w:type="gramEnd"/>
       <w:r>
-        <w:t xml:space="preserve">Felicitaciones por la entrega del Desafío 04! </w:t>
+        <w:t xml:space="preserve">Felicitaciones por la entrega del Desafío 05! </w:t>
       </w:r>
       <w:r>
         <w:rPr>
@@ -1409,85 +1719,80 @@
     <w:p/>
     <w:p>
       <w:r>
-        <w:t>Santino, muy buen trabajo, te felicito. Destaco la prolijidad de tu proyecto.</w:t>
-      </w:r>
-    </w:p>
-    <w:p/>
-    <w:p>
-      <w:r>
-        <w:t xml:space="preserve">La estructura HTML esta correcta, destaco la correcta implementación de contenedores semánticos como </w:t>
-      </w:r>
-      <w:proofErr w:type="spellStart"/>
-      <w:r>
-        <w:t>main</w:t>
-      </w:r>
-      <w:proofErr w:type="spellEnd"/>
-      <w:r>
-        <w:t xml:space="preserve">, </w:t>
-      </w:r>
-      <w:proofErr w:type="spellStart"/>
-      <w:r>
-        <w:t>section</w:t>
-      </w:r>
-      <w:proofErr w:type="spellEnd"/>
-      <w:r>
-        <w:t xml:space="preserve">, </w:t>
-      </w:r>
-      <w:proofErr w:type="spellStart"/>
-      <w:r>
-        <w:t>footer</w:t>
-      </w:r>
-      <w:proofErr w:type="spellEnd"/>
-      <w:r>
-        <w:t xml:space="preserve">, etc. </w:t>
-      </w:r>
-    </w:p>
-    <w:p/>
-    <w:p>
-      <w:r>
-        <w:t>En la parte de Navegación principal recomiendo contener los &lt;</w:t>
-      </w:r>
-      <w:proofErr w:type="spellStart"/>
-      <w:r>
-        <w:t>li</w:t>
-      </w:r>
-      <w:proofErr w:type="spellEnd"/>
-      <w:r>
-        <w:t>&gt; en la etiqueta &lt;</w:t>
-      </w:r>
-      <w:proofErr w:type="spellStart"/>
-      <w:r>
-        <w:t>ul</w:t>
-      </w:r>
-      <w:proofErr w:type="spellEnd"/>
-      <w:r>
-        <w:t xml:space="preserve">&gt; queda </w:t>
-      </w:r>
-      <w:proofErr w:type="spellStart"/>
-      <w:r>
-        <w:t>mas</w:t>
-      </w:r>
-      <w:proofErr w:type="spellEnd"/>
-      <w:r>
-        <w:t xml:space="preserve"> correcto semánticamente.</w:t>
-      </w:r>
-    </w:p>
-    <w:p/>
-    <w:p>
-      <w:r>
-        <w:t xml:space="preserve">También </w:t>
-      </w:r>
-      <w:proofErr w:type="spellStart"/>
-      <w:r>
-        <w:t>recordá</w:t>
-      </w:r>
-      <w:proofErr w:type="spellEnd"/>
-      <w:r>
-        <w:t xml:space="preserve"> cambiar el lenguaje a español &lt;</w:t>
-      </w:r>
-      <w:proofErr w:type="spellStart"/>
-      <w:r>
-        <w:t>html</w:t>
+        <w:t>Santino</w:t>
+      </w:r>
+      <w:r>
+        <w:t>, muy buen trabajo, te felicito</w:t>
+      </w:r>
+      <w:r>
+        <w:t xml:space="preserve"> por el compromiso en realizar las entregas.</w:t>
+      </w:r>
+    </w:p>
+    <w:p/>
+    <w:p>
+      <w:r>
+        <w:t xml:space="preserve">La declaración y uso de variables </w:t>
+      </w:r>
+      <w:r>
+        <w:t>“</w:t>
+      </w:r>
+      <w:proofErr w:type="spellStart"/>
+      <w:r>
+        <w:t>let</w:t>
+      </w:r>
+      <w:proofErr w:type="spellEnd"/>
+      <w:r>
+        <w:t>”</w:t>
+      </w:r>
+      <w:r>
+        <w:t xml:space="preserve"> y </w:t>
+      </w:r>
+      <w:r>
+        <w:t>“</w:t>
+      </w:r>
+      <w:proofErr w:type="spellStart"/>
+      <w:r>
+        <w:t>const</w:t>
+      </w:r>
+      <w:proofErr w:type="spellEnd"/>
+      <w:r>
+        <w:t>”</w:t>
+      </w:r>
+      <w:r>
+        <w:t xml:space="preserve"> esta </w:t>
+      </w:r>
+      <w:r>
+        <w:t>impecable.</w:t>
+      </w:r>
+    </w:p>
+    <w:p/>
+    <w:p>
+      <w:r>
+        <w:t xml:space="preserve">Manipulaste correctamente los tipos de datos para cada situación y los nombres asignados a variables son descriptivos como se </w:t>
+      </w:r>
+      <w:proofErr w:type="spellStart"/>
+      <w:r>
+        <w:t>solicito</w:t>
+      </w:r>
+      <w:proofErr w:type="spellEnd"/>
+      <w:r>
+        <w:t>.</w:t>
+      </w:r>
+    </w:p>
+    <w:p/>
+    <w:p>
+      <w:r>
+        <w:t>Correcto el uso de operadores matemáticos y los resultados guardados en variables.</w:t>
+      </w:r>
+    </w:p>
+    <w:p/>
+    <w:p>
+      <w:r>
+        <w:t xml:space="preserve">Falto implementar </w:t>
+      </w:r>
+      <w:proofErr w:type="spellStart"/>
+      <w:r>
+        <w:t>template</w:t>
       </w:r>
       <w:proofErr w:type="spellEnd"/>
       <w:r>
@@ -1495,91 +1800,80 @@
       </w:r>
       <w:proofErr w:type="spellStart"/>
       <w:r>
-        <w:t>lang</w:t>
-      </w:r>
-      <w:proofErr w:type="spellEnd"/>
-      <w:r>
-        <w:t xml:space="preserve">="es"&gt; porque esto </w:t>
+        <w:t>strings</w:t>
+      </w:r>
+      <w:proofErr w:type="spellEnd"/>
+      <w:r>
+        <w:t xml:space="preserve"> en lugar de concatenar textos con variables, por </w:t>
       </w:r>
       <w:proofErr w:type="gramStart"/>
       <w:r>
-        <w:t>le</w:t>
+        <w:t>ejemplo</w:t>
       </w:r>
       <w:proofErr w:type="gramEnd"/>
       <w:r>
-        <w:t xml:space="preserve"> dice a los motores de búsqueda en que idioma esta tu sitio web.</w:t>
-      </w:r>
-    </w:p>
-    <w:p/>
-    <w:p/>
-    <w:p/>
-    <w:p/>
-    <w:p/>
-    <w:p>
-      <w:r>
-        <w:t xml:space="preserve">La implementación de position para superponer el banner quedo perfecto. </w:t>
-      </w:r>
-    </w:p>
-    <w:p/>
-    <w:p>
-      <w:r>
-        <w:t xml:space="preserve">La disposición de elementos en la </w:t>
-      </w:r>
-      <w:proofErr w:type="spellStart"/>
-      <w:r>
-        <w:t>landing</w:t>
-      </w:r>
-      <w:proofErr w:type="spellEnd"/>
-      <w:r>
-        <w:t xml:space="preserve"> page quedo tal cual lo solicitado con la herramienta Flex.</w:t>
-      </w:r>
-    </w:p>
-    <w:p/>
-    <w:p>
-      <w:r>
-        <w:t xml:space="preserve">Correctamente creadas la tabla y recurso de video. </w:t>
-      </w:r>
-    </w:p>
-    <w:p/>
-    <w:p>
-      <w:r>
-        <w:t xml:space="preserve">En los estilos los colores, tipografías y espaciado quedaron ok, falto agregar efectos </w:t>
-      </w:r>
-      <w:proofErr w:type="spellStart"/>
-      <w:r>
-        <w:t>hover</w:t>
-      </w:r>
-      <w:proofErr w:type="spellEnd"/>
-      <w:r>
-        <w:t xml:space="preserve"> en la barra de navegación principal y en las </w:t>
-      </w:r>
-      <w:proofErr w:type="spellStart"/>
-      <w:r>
-        <w:t>cards</w:t>
-      </w:r>
-      <w:proofErr w:type="spellEnd"/>
-      <w:r>
-        <w:t xml:space="preserve"> de productos.</w:t>
-      </w:r>
-    </w:p>
-    <w:p/>
-    <w:p/>
-    <w:p>
-      <w:r>
-        <w:t>Excelente trabajo ¡</w:t>
-      </w:r>
-    </w:p>
-    <w:p/>
-    <w:p>
-      <w:r>
-        <w:t xml:space="preserve">Tu nota en el Desafío 04 es: </w:t>
-      </w:r>
-      <w:r>
-        <w:rPr>
-          <w:b/>
-          <w:bCs/>
-        </w:rPr>
-        <w:t>10</w:t>
+        <w:t xml:space="preserve"> en el ejercicio </w:t>
+      </w:r>
+      <w:proofErr w:type="spellStart"/>
+      <w:r>
+        <w:t>nro</w:t>
+      </w:r>
+      <w:proofErr w:type="spellEnd"/>
+      <w:r>
+        <w:t xml:space="preserve"> 4 </w:t>
+      </w:r>
+      <w:proofErr w:type="spellStart"/>
+      <w:r>
+        <w:t>quedaria</w:t>
+      </w:r>
+      <w:proofErr w:type="spellEnd"/>
+      <w:r>
+        <w:t>:</w:t>
+      </w:r>
+    </w:p>
+    <w:p/>
+    <w:p>
+      <w:r>
+        <w:tab/>
+      </w:r>
+      <w:proofErr w:type="gramStart"/>
+      <w:r>
+        <w:t>console.log(</w:t>
+      </w:r>
+      <w:proofErr w:type="gramEnd"/>
+      <w:r>
+        <w:t>`El promedio sin redondear es:  ${promedio}`);</w:t>
+      </w:r>
+    </w:p>
+    <w:p/>
+    <w:p/>
+    <w:p>
+      <w:r>
+        <w:t>Quiero destacar la prolijidad de tu código.</w:t>
+      </w:r>
+    </w:p>
+    <w:p/>
+    <w:p/>
+    <w:p/>
+    <w:p>
+      <w:r>
+        <w:t>Muy buen</w:t>
+      </w:r>
+      <w:r>
+        <w:t xml:space="preserve"> trabajo ¡</w:t>
+      </w:r>
+    </w:p>
+    <w:p/>
+    <w:p>
+      <w:r>
+        <w:t xml:space="preserve">Tu nota en el Desafío 05 es: </w:t>
+      </w:r>
+      <w:r>
+        <w:rPr>
+          <w:b/>
+          <w:bCs/>
+        </w:rPr>
+        <w:t>9</w:t>
       </w:r>
     </w:p>
     <w:p/>
@@ -1635,7 +1929,7 @@
       </w:r>
       <w:proofErr w:type="gramEnd"/>
       <w:r>
-        <w:t xml:space="preserve">Felicitaciones por la entrega del Desafío 04! </w:t>
+        <w:t xml:space="preserve">Felicitaciones por la entrega del Desafío 05! </w:t>
       </w:r>
       <w:r>
         <w:rPr>
@@ -1646,66 +1940,126 @@
     </w:p>
     <w:p/>
     <w:p>
-      <w:r>
-        <w:t xml:space="preserve">Hipolito, excelente trabajo, te felicito. </w:t>
-      </w:r>
-    </w:p>
-    <w:p/>
-    <w:p>
-      <w:r>
-        <w:t xml:space="preserve">La estructura HTML esta impecable, destaco la correcta implementación de contenedores semánticos como </w:t>
-      </w:r>
-      <w:proofErr w:type="spellStart"/>
-      <w:r>
-        <w:t>main</w:t>
-      </w:r>
-      <w:proofErr w:type="spellEnd"/>
-      <w:r>
-        <w:t xml:space="preserve">, </w:t>
-      </w:r>
-      <w:proofErr w:type="spellStart"/>
-      <w:r>
-        <w:t>section</w:t>
-      </w:r>
-      <w:proofErr w:type="spellEnd"/>
-      <w:r>
-        <w:t xml:space="preserve">, </w:t>
-      </w:r>
-      <w:proofErr w:type="spellStart"/>
-      <w:r>
-        <w:t>footer</w:t>
-      </w:r>
-      <w:proofErr w:type="spellEnd"/>
-      <w:r>
-        <w:t>, etc.</w:t>
-      </w:r>
-    </w:p>
-    <w:p/>
-    <w:p>
-      <w:r>
-        <w:t xml:space="preserve">La implementación de position para superponer el banner quedo perfecto. </w:t>
-      </w:r>
-    </w:p>
-    <w:p/>
-    <w:p>
-      <w:r>
-        <w:t xml:space="preserve">La disposición de elementos en la </w:t>
-      </w:r>
-      <w:proofErr w:type="spellStart"/>
-      <w:r>
-        <w:t>landing</w:t>
-      </w:r>
-      <w:proofErr w:type="spellEnd"/>
-      <w:r>
-        <w:t xml:space="preserve"> page quedo tal cual lo solicitado con la herramienta Flex.</w:t>
-      </w:r>
-    </w:p>
-    <w:p/>
-    <w:p>
-      <w:r>
-        <w:t>Correctamente creadas la tabla y recurso de video. Los estilos tal cual los solicitados en imágenes de referencia.</w:t>
-      </w:r>
-    </w:p>
+      <w:proofErr w:type="spellStart"/>
+      <w:r>
+        <w:t>Hipolito</w:t>
+      </w:r>
+      <w:proofErr w:type="spellEnd"/>
+      <w:r>
+        <w:t>, muy buen trabajo, te felicito</w:t>
+      </w:r>
+      <w:r>
+        <w:t xml:space="preserve"> por la entrega.</w:t>
+      </w:r>
+    </w:p>
+    <w:p/>
+    <w:p>
+      <w:r>
+        <w:t>En cuanto a la implementación</w:t>
+      </w:r>
+      <w:r>
+        <w:t xml:space="preserve"> de variables </w:t>
+      </w:r>
+      <w:r>
+        <w:t>“</w:t>
+      </w:r>
+      <w:proofErr w:type="spellStart"/>
+      <w:r>
+        <w:t>let</w:t>
+      </w:r>
+      <w:proofErr w:type="spellEnd"/>
+      <w:r>
+        <w:t>”</w:t>
+      </w:r>
+      <w:r>
+        <w:t xml:space="preserve"> y </w:t>
+      </w:r>
+      <w:r>
+        <w:t>“</w:t>
+      </w:r>
+      <w:proofErr w:type="spellStart"/>
+      <w:r>
+        <w:t>const</w:t>
+      </w:r>
+      <w:proofErr w:type="spellEnd"/>
+      <w:r>
+        <w:t>” falto aplicar variables “</w:t>
+      </w:r>
+      <w:proofErr w:type="spellStart"/>
+      <w:r>
+        <w:t>let</w:t>
+      </w:r>
+      <w:proofErr w:type="spellEnd"/>
+      <w:r>
+        <w:t>”, las variables “</w:t>
+      </w:r>
+      <w:proofErr w:type="spellStart"/>
+      <w:r>
+        <w:t>const</w:t>
+      </w:r>
+      <w:proofErr w:type="spellEnd"/>
+      <w:r>
+        <w:t>” conceptualmente en estos ejercicios son mas para valores como el “</w:t>
+      </w:r>
+      <w:proofErr w:type="spellStart"/>
+      <w:r>
+        <w:t>iva</w:t>
+      </w:r>
+      <w:proofErr w:type="spellEnd"/>
+      <w:r>
+        <w:t>” que son objetos que quedan permanentes.</w:t>
+      </w:r>
+    </w:p>
+    <w:p/>
+    <w:p>
+      <w:r>
+        <w:lastRenderedPageBreak/>
+        <w:t>Manipulaste correctamente los tipos de datos para cada situación y los nombres asignados a variables son descriptivos como se solicitó.</w:t>
+      </w:r>
+    </w:p>
+    <w:p/>
+    <w:p>
+      <w:r>
+        <w:t>Correcto el uso de operadores matemáticos y los resultados guardados en variables.</w:t>
+      </w:r>
+    </w:p>
+    <w:p/>
+    <w:p>
+      <w:r>
+        <w:t xml:space="preserve">Buenísimo que te manejaste con </w:t>
+      </w:r>
+      <w:proofErr w:type="spellStart"/>
+      <w:r>
+        <w:t>template</w:t>
+      </w:r>
+      <w:proofErr w:type="spellEnd"/>
+      <w:r>
+        <w:t xml:space="preserve"> </w:t>
+      </w:r>
+      <w:proofErr w:type="spellStart"/>
+      <w:r>
+        <w:t>literals</w:t>
+      </w:r>
+      <w:proofErr w:type="spellEnd"/>
+      <w:r>
+        <w:t xml:space="preserve"> en lugar de concatenar </w:t>
+      </w:r>
+      <w:proofErr w:type="spellStart"/>
+      <w:r>
+        <w:t>strings</w:t>
+      </w:r>
+      <w:proofErr w:type="spellEnd"/>
+      <w:r>
+        <w:t>.</w:t>
+      </w:r>
+    </w:p>
+    <w:p/>
+    <w:p>
+      <w:r>
+        <w:t>Quiero destacar la prolijidad de tu código.</w:t>
+      </w:r>
+    </w:p>
+    <w:p/>
     <w:p/>
     <w:p/>
     <w:p>
@@ -1716,14 +2070,14 @@
     <w:p/>
     <w:p>
       <w:r>
-        <w:t xml:space="preserve">Tu nota en el Desafío 04 es: </w:t>
-      </w:r>
-      <w:r>
-        <w:rPr>
-          <w:b/>
-          <w:bCs/>
-        </w:rPr>
-        <w:t>10</w:t>
+        <w:t xml:space="preserve">Tu nota en el Desafío 05 es: </w:t>
+      </w:r>
+      <w:r>
+        <w:rPr>
+          <w:b/>
+          <w:bCs/>
+        </w:rPr>
+        <w:t>9</w:t>
       </w:r>
     </w:p>
     <w:p>
@@ -1785,7 +2139,7 @@
       </w:r>
       <w:proofErr w:type="gramEnd"/>
       <w:r>
-        <w:t xml:space="preserve">Felicitaciones por la entrega del Desafío 04! </w:t>
+        <w:t xml:space="preserve">Felicitaciones por la entrega del Desafío 05! </w:t>
       </w:r>
       <w:r>
         <w:rPr>
@@ -1797,21 +2151,40 @@
     <w:p/>
     <w:p>
       <w:r>
-        <w:t>Tomas, muy buen trabajo, te felicito por el compromiso en realizar las entregas.</w:t>
-      </w:r>
-    </w:p>
-    <w:p/>
-    <w:p>
-      <w:r>
-        <w:t xml:space="preserve">La estructura HTML presenta algunos errores, el contenedor </w:t>
-      </w:r>
-      <w:proofErr w:type="spellStart"/>
-      <w:r>
-        <w:t>header</w:t>
-      </w:r>
-      <w:proofErr w:type="spellEnd"/>
-      <w:r>
-        <w:t xml:space="preserve"> no tiene cierre. En este caso con el uso de un solo contenedor Footer </w:t>
+        <w:t>Tomas</w:t>
+      </w:r>
+      <w:r>
+        <w:t>, muy buen trabajo, te felicito por el compromiso en realizar las entregas.</w:t>
+      </w:r>
+    </w:p>
+    <w:p/>
+    <w:p>
+      <w:r>
+        <w:t>La declaración y uso de variables “</w:t>
+      </w:r>
+      <w:proofErr w:type="spellStart"/>
+      <w:r>
+        <w:t>let</w:t>
+      </w:r>
+      <w:proofErr w:type="spellEnd"/>
+      <w:r>
+        <w:t>” y “</w:t>
+      </w:r>
+      <w:proofErr w:type="spellStart"/>
+      <w:r>
+        <w:t>const</w:t>
+      </w:r>
+      <w:proofErr w:type="spellEnd"/>
+      <w:r>
+        <w:t xml:space="preserve">” esta correcta, falto declarar variables con </w:t>
+      </w:r>
+      <w:proofErr w:type="spellStart"/>
+      <w:r>
+        <w:t>let</w:t>
+      </w:r>
+      <w:proofErr w:type="spellEnd"/>
+      <w:r>
+        <w:t xml:space="preserve"> en el documento, si bien en estos ejercicios no </w:t>
       </w:r>
       <w:proofErr w:type="spellStart"/>
       <w:r>
@@ -1819,46 +2192,151 @@
       </w:r>
       <w:proofErr w:type="spellEnd"/>
       <w:r>
-        <w:t xml:space="preserve"> correcto.</w:t>
-      </w:r>
-    </w:p>
-    <w:p/>
-    <w:p>
-      <w:r>
-        <w:t xml:space="preserve">La implementación de position para superponer el banner quedo perfecto. </w:t>
-      </w:r>
-    </w:p>
-    <w:p/>
-    <w:p>
-      <w:r>
-        <w:t xml:space="preserve">La disposición de elementos en la </w:t>
-      </w:r>
-      <w:proofErr w:type="spellStart"/>
-      <w:r>
-        <w:t>landing</w:t>
-      </w:r>
-      <w:proofErr w:type="spellEnd"/>
-      <w:r>
-        <w:t xml:space="preserve"> page quedo tal cual lo solicitado con la herramienta Flex.</w:t>
-      </w:r>
-    </w:p>
-    <w:p/>
-    <w:p>
-      <w:r>
-        <w:t>Correctamente creadas la tabla y recurso de video. Los estilos tal cual los solicitados en imágenes de referencia.</w:t>
-      </w:r>
-    </w:p>
-    <w:p/>
-    <w:p/>
-    <w:p>
-      <w:r>
-        <w:t>Excelente trabajo ¡</w:t>
-      </w:r>
-    </w:p>
-    <w:p/>
-    <w:p>
-      <w:r>
-        <w:t xml:space="preserve">Tu nota en el Desafío 04 es: </w:t>
+        <w:t xml:space="preserve"> mal usar </w:t>
+      </w:r>
+      <w:proofErr w:type="spellStart"/>
+      <w:r>
+        <w:t>const</w:t>
+      </w:r>
+      <w:proofErr w:type="spellEnd"/>
+      <w:r>
+        <w:t xml:space="preserve"> conceptualmente queda mejor usarlo </w:t>
+      </w:r>
+      <w:r>
+        <w:rPr>
+          <w:u w:val="single"/>
+        </w:rPr>
+        <w:t>para</w:t>
+      </w:r>
+      <w:r>
+        <w:t xml:space="preserve"> objetos como el “</w:t>
+      </w:r>
+      <w:proofErr w:type="spellStart"/>
+      <w:r>
+        <w:t>iva</w:t>
+      </w:r>
+      <w:proofErr w:type="spellEnd"/>
+      <w:r>
+        <w:t>” que son valores que sabemos que son permanentes.</w:t>
+      </w:r>
+    </w:p>
+    <w:p/>
+    <w:p>
+      <w:r>
+        <w:t xml:space="preserve">Manipulaste correctamente los tipos de datos para cada situación y los nombres asignados a variables son descriptivos como se </w:t>
+      </w:r>
+      <w:proofErr w:type="spellStart"/>
+      <w:r>
+        <w:t>solicito</w:t>
+      </w:r>
+      <w:proofErr w:type="spellEnd"/>
+      <w:r>
+        <w:t>.</w:t>
+      </w:r>
+    </w:p>
+    <w:p/>
+    <w:p>
+      <w:r>
+        <w:t>Correcto el uso de operadores matemáticos y los resultados guardados en variables.</w:t>
+      </w:r>
+    </w:p>
+    <w:p/>
+    <w:p>
+      <w:r>
+        <w:lastRenderedPageBreak/>
+        <w:t>Recomiendo usar</w:t>
+      </w:r>
+      <w:r>
+        <w:t xml:space="preserve"> tem</w:t>
+      </w:r>
+      <w:proofErr w:type="spellStart"/>
+      <w:r>
+        <w:t>plate</w:t>
+      </w:r>
+      <w:proofErr w:type="spellEnd"/>
+      <w:r>
+        <w:t xml:space="preserve"> </w:t>
+      </w:r>
+      <w:proofErr w:type="spellStart"/>
+      <w:r>
+        <w:t>strings</w:t>
+      </w:r>
+      <w:proofErr w:type="spellEnd"/>
+      <w:r>
+        <w:t xml:space="preserve"> en lugar de concatenar textos con variables, por </w:t>
+      </w:r>
+      <w:proofErr w:type="gramStart"/>
+      <w:r>
+        <w:t>ejemplo</w:t>
+      </w:r>
+      <w:proofErr w:type="gramEnd"/>
+      <w:r>
+        <w:t xml:space="preserve"> en el ejercicio </w:t>
+      </w:r>
+      <w:proofErr w:type="spellStart"/>
+      <w:r>
+        <w:t>nro</w:t>
+      </w:r>
+      <w:proofErr w:type="spellEnd"/>
+      <w:r>
+        <w:t xml:space="preserve"> </w:t>
+      </w:r>
+      <w:r>
+        <w:t>7</w:t>
+      </w:r>
+      <w:r>
+        <w:t xml:space="preserve"> </w:t>
+      </w:r>
+      <w:proofErr w:type="spellStart"/>
+      <w:r>
+        <w:t>quedaria</w:t>
+      </w:r>
+      <w:proofErr w:type="spellEnd"/>
+      <w:r>
+        <w:t>:</w:t>
+      </w:r>
+    </w:p>
+    <w:p/>
+    <w:p>
+      <w:r>
+        <w:tab/>
+      </w:r>
+      <w:proofErr w:type="gramStart"/>
+      <w:r>
+        <w:t>console.log(</w:t>
+      </w:r>
+      <w:proofErr w:type="gramEnd"/>
+      <w:r>
+        <w:t>`Importe de la compra: $ ${</w:t>
+      </w:r>
+      <w:proofErr w:type="spellStart"/>
+      <w:r>
+        <w:t>importeCompra</w:t>
+      </w:r>
+      <w:proofErr w:type="spellEnd"/>
+      <w:r>
+        <w:t>}`);</w:t>
+      </w:r>
+    </w:p>
+    <w:p/>
+    <w:p/>
+    <w:p>
+      <w:r>
+        <w:t>Quiero destacar la prolijidad de tu código.</w:t>
+      </w:r>
+    </w:p>
+    <w:p/>
+    <w:p/>
+    <w:p/>
+    <w:p>
+      <w:r>
+        <w:t>Muy buen trabajo ¡</w:t>
+      </w:r>
+    </w:p>
+    <w:p/>
+    <w:p>
+      <w:r>
+        <w:t xml:space="preserve">Tu nota en el Desafío 05 es: </w:t>
       </w:r>
       <w:r>
         <w:rPr>
@@ -1930,7 +2408,7 @@
       </w:r>
       <w:proofErr w:type="gramEnd"/>
       <w:r>
-        <w:t xml:space="preserve">Felicitaciones por la entrega del Desafío 04! </w:t>
+        <w:t xml:space="preserve">Felicitaciones por la entrega del Desafío 05! </w:t>
       </w:r>
       <w:r>
         <w:rPr>
@@ -1942,88 +2420,106 @@
     <w:p/>
     <w:p>
       <w:r>
-        <w:t>Ariana, muy buen trabajo, te felicito. Destaco la prolijidad de tu proyecto.</w:t>
-      </w:r>
-    </w:p>
-    <w:p/>
-    <w:p>
-      <w:r>
-        <w:t xml:space="preserve">La estructura HTML esta impecable, destaco la correcta implementación de contenedores semánticos como </w:t>
-      </w:r>
-      <w:proofErr w:type="spellStart"/>
-      <w:r>
-        <w:t>main</w:t>
-      </w:r>
-      <w:proofErr w:type="spellEnd"/>
-      <w:r>
-        <w:t xml:space="preserve">, </w:t>
-      </w:r>
-      <w:proofErr w:type="spellStart"/>
-      <w:r>
-        <w:t>section</w:t>
-      </w:r>
-      <w:proofErr w:type="spellEnd"/>
-      <w:r>
-        <w:t xml:space="preserve">, </w:t>
-      </w:r>
-      <w:proofErr w:type="spellStart"/>
-      <w:r>
-        <w:t>footer</w:t>
-      </w:r>
-      <w:proofErr w:type="spellEnd"/>
-      <w:r>
-        <w:t>, etc.</w:t>
-      </w:r>
-    </w:p>
-    <w:p/>
-    <w:p>
-      <w:r>
-        <w:t xml:space="preserve">La implementación de position para superponer el banner quedo perfecto. </w:t>
+        <w:t>Ariana</w:t>
+      </w:r>
+      <w:r>
+        <w:t>, muy buen trabajo, te felicito</w:t>
+      </w:r>
+      <w:r>
+        <w:t xml:space="preserve"> por el compromiso en realizar las entregas.</w:t>
+      </w:r>
+    </w:p>
+    <w:p/>
+    <w:p>
+      <w:r>
+        <w:t xml:space="preserve">La declaración y uso de variables </w:t>
+      </w:r>
+      <w:proofErr w:type="spellStart"/>
+      <w:r>
+        <w:t>let</w:t>
+      </w:r>
+      <w:proofErr w:type="spellEnd"/>
+      <w:r>
+        <w:t xml:space="preserve"> y </w:t>
+      </w:r>
+      <w:proofErr w:type="spellStart"/>
+      <w:r>
+        <w:t>const</w:t>
+      </w:r>
+      <w:proofErr w:type="spellEnd"/>
+      <w:r>
+        <w:t xml:space="preserve"> esta correcta</w:t>
+      </w:r>
+      <w:r>
+        <w:t xml:space="preserve">, eso es </w:t>
+      </w:r>
+      <w:proofErr w:type="spellStart"/>
+      <w:r>
+        <w:t>buenisimo</w:t>
+      </w:r>
+      <w:proofErr w:type="spellEnd"/>
+      <w:r>
+        <w:t xml:space="preserve"> ¡</w:t>
+      </w:r>
+    </w:p>
+    <w:p/>
+    <w:p>
+      <w:r>
+        <w:t xml:space="preserve">Manipulaste correctamente los tipos de datos para cada situación y los nombres asignados a variables son descriptivos como se </w:t>
+      </w:r>
+      <w:proofErr w:type="spellStart"/>
+      <w:r>
+        <w:t>solicito</w:t>
+      </w:r>
+      <w:proofErr w:type="spellEnd"/>
+      <w:r>
+        <w:t>.</w:t>
+      </w:r>
+    </w:p>
+    <w:p/>
+    <w:p>
+      <w:r>
+        <w:t>Correcto el uso de operadores matemáticos y los resultados guardados en variables.</w:t>
+      </w:r>
+    </w:p>
+    <w:p/>
+    <w:p>
+      <w:r>
+        <w:t xml:space="preserve">Buenísimo que te manejaste con </w:t>
+      </w:r>
+      <w:proofErr w:type="spellStart"/>
+      <w:r>
+        <w:t>template</w:t>
+      </w:r>
+      <w:proofErr w:type="spellEnd"/>
+      <w:r>
+        <w:t xml:space="preserve"> </w:t>
+      </w:r>
+      <w:proofErr w:type="spellStart"/>
+      <w:r>
+        <w:t>literals</w:t>
+      </w:r>
+      <w:proofErr w:type="spellEnd"/>
+      <w:r>
+        <w:t xml:space="preserve"> en lugar de concatenar </w:t>
+      </w:r>
+      <w:proofErr w:type="spellStart"/>
+      <w:r>
+        <w:t>strings</w:t>
+      </w:r>
+      <w:proofErr w:type="spellEnd"/>
+      <w:r>
+        <w:t>.</w:t>
       </w:r>
     </w:p>
     <w:p/>
     <w:p>
       <w:r>
         <w:lastRenderedPageBreak/>
-        <w:t xml:space="preserve">La disposición de elementos en la </w:t>
-      </w:r>
-      <w:proofErr w:type="spellStart"/>
-      <w:r>
-        <w:t>landing</w:t>
-      </w:r>
-      <w:proofErr w:type="spellEnd"/>
-      <w:r>
-        <w:t xml:space="preserve"> page quedo tal cual lo solicitado con la herramienta Flex.</w:t>
-      </w:r>
-    </w:p>
-    <w:p/>
-    <w:p>
-      <w:r>
-        <w:t xml:space="preserve">Correctamente creadas la tabla y recurso de video. </w:t>
-      </w:r>
-    </w:p>
-    <w:p/>
-    <w:p>
-      <w:r>
-        <w:t xml:space="preserve">En los estilos los colores, tipografías y espaciado quedaron ok, falto agregar efectos </w:t>
-      </w:r>
-      <w:proofErr w:type="spellStart"/>
-      <w:r>
-        <w:t>hover</w:t>
-      </w:r>
-      <w:proofErr w:type="spellEnd"/>
-      <w:r>
-        <w:t xml:space="preserve"> en la barra de navegación principal y en las </w:t>
-      </w:r>
-      <w:proofErr w:type="spellStart"/>
-      <w:r>
-        <w:t>cards</w:t>
-      </w:r>
-      <w:proofErr w:type="spellEnd"/>
-      <w:r>
-        <w:t xml:space="preserve"> de productos.</w:t>
-      </w:r>
-    </w:p>
+        <w:t>Quiero destacar la prolijidad de tu código.</w:t>
+      </w:r>
+    </w:p>
+    <w:p/>
     <w:p/>
     <w:p/>
     <w:p>
@@ -2034,7 +2530,7 @@
     <w:p/>
     <w:p>
       <w:r>
-        <w:t xml:space="preserve">Tu nota en el Desafío 04 es: </w:t>
+        <w:t xml:space="preserve">Tu nota en el Desafío 05 es: </w:t>
       </w:r>
       <w:r>
         <w:rPr>
@@ -2107,7 +2603,7 @@
       </w:r>
       <w:proofErr w:type="gramEnd"/>
       <w:r>
-        <w:t xml:space="preserve">Felicitaciones por la entrega del Desafío 04! </w:t>
+        <w:t xml:space="preserve">Felicitaciones por la entrega del Desafío 05! </w:t>
       </w:r>
       <w:r>
         <w:rPr>
@@ -2119,77 +2615,122 @@
     <w:p/>
     <w:p>
       <w:r>
-        <w:t xml:space="preserve">Franco, excelente trabajo, te felicito. </w:t>
-      </w:r>
-    </w:p>
-    <w:p/>
-    <w:p>
-      <w:r>
-        <w:t xml:space="preserve">La estructura HTML esta impecable, destaco la correcta implementación de contenedores semánticos como </w:t>
-      </w:r>
-      <w:proofErr w:type="spellStart"/>
-      <w:r>
-        <w:t>main</w:t>
-      </w:r>
-      <w:proofErr w:type="spellEnd"/>
-      <w:r>
-        <w:t xml:space="preserve">, </w:t>
-      </w:r>
-      <w:proofErr w:type="spellStart"/>
-      <w:r>
-        <w:t>section</w:t>
-      </w:r>
-      <w:proofErr w:type="spellEnd"/>
-      <w:r>
-        <w:t xml:space="preserve">, </w:t>
-      </w:r>
-      <w:proofErr w:type="spellStart"/>
-      <w:r>
-        <w:t>footer</w:t>
-      </w:r>
-      <w:proofErr w:type="spellEnd"/>
-      <w:r>
-        <w:t>, etc.</w:t>
-      </w:r>
-    </w:p>
-    <w:p/>
-    <w:p>
-      <w:r>
-        <w:t xml:space="preserve">La implementación de position para superponer el banner quedo perfecto. </w:t>
-      </w:r>
-    </w:p>
-    <w:p/>
-    <w:p>
-      <w:r>
-        <w:t xml:space="preserve">La disposición de elementos en la </w:t>
-      </w:r>
-      <w:proofErr w:type="spellStart"/>
-      <w:r>
-        <w:t>landing</w:t>
-      </w:r>
-      <w:proofErr w:type="spellEnd"/>
-      <w:r>
-        <w:t xml:space="preserve"> page quedo tal cual lo solicitado con la herramienta Flex.</w:t>
-      </w:r>
-    </w:p>
-    <w:p/>
-    <w:p>
-      <w:r>
-        <w:t>Correctamente creadas la tabla y recurso de video. Los estilos tal cual los solicitados en imágenes de referencia.</w:t>
-      </w:r>
-    </w:p>
-    <w:p/>
-    <w:p/>
-    <w:p>
-      <w:r>
-        <w:lastRenderedPageBreak/>
+        <w:t>Franco</w:t>
+      </w:r>
+      <w:r>
+        <w:t>, muy buen trabajo, te felicito</w:t>
+      </w:r>
+    </w:p>
+    <w:p/>
+    <w:p>
+      <w:r>
+        <w:t xml:space="preserve">La declaración y uso de variables </w:t>
+      </w:r>
+      <w:proofErr w:type="spellStart"/>
+      <w:r>
+        <w:t>let</w:t>
+      </w:r>
+      <w:proofErr w:type="spellEnd"/>
+      <w:r>
+        <w:t xml:space="preserve"> y </w:t>
+      </w:r>
+      <w:proofErr w:type="spellStart"/>
+      <w:r>
+        <w:t>const</w:t>
+      </w:r>
+      <w:proofErr w:type="spellEnd"/>
+      <w:r>
+        <w:t xml:space="preserve"> esta correcta, en el ejercicio </w:t>
+      </w:r>
+      <w:proofErr w:type="spellStart"/>
+      <w:r>
+        <w:t>nro</w:t>
+      </w:r>
+      <w:proofErr w:type="spellEnd"/>
+      <w:r>
+        <w:t xml:space="preserve"> 7 el valor del interés </w:t>
+      </w:r>
+      <w:proofErr w:type="spellStart"/>
+      <w:r>
+        <w:t>podés</w:t>
+      </w:r>
+      <w:proofErr w:type="spellEnd"/>
+      <w:r>
+        <w:t xml:space="preserve"> manejarlo como una constante </w:t>
+      </w:r>
+      <w:r>
+        <w:t>también</w:t>
+      </w:r>
+      <w:r>
+        <w:t>.</w:t>
+      </w:r>
+    </w:p>
+    <w:p/>
+    <w:p>
+      <w:r>
+        <w:t xml:space="preserve">Manipulaste correctamente los tipos de datos para cada situación y los nombres asignados a variables son descriptivos como se </w:t>
+      </w:r>
+      <w:r>
+        <w:t>solicitó</w:t>
+      </w:r>
+      <w:r>
+        <w:t>.</w:t>
+      </w:r>
+    </w:p>
+    <w:p/>
+    <w:p>
+      <w:r>
+        <w:t>Correcto el uso de operadores matemáticos y los resultados guardados en variables.</w:t>
+      </w:r>
+    </w:p>
+    <w:p/>
+    <w:p>
+      <w:r>
+        <w:t xml:space="preserve">Buenísimo que te manejaste con </w:t>
+      </w:r>
+      <w:proofErr w:type="spellStart"/>
+      <w:r>
+        <w:t>template</w:t>
+      </w:r>
+      <w:proofErr w:type="spellEnd"/>
+      <w:r>
+        <w:t xml:space="preserve"> </w:t>
+      </w:r>
+      <w:proofErr w:type="spellStart"/>
+      <w:r>
+        <w:t>literals</w:t>
+      </w:r>
+      <w:proofErr w:type="spellEnd"/>
+      <w:r>
+        <w:t xml:space="preserve"> en lugar de concatenar </w:t>
+      </w:r>
+      <w:proofErr w:type="spellStart"/>
+      <w:r>
+        <w:t>strings</w:t>
+      </w:r>
+      <w:proofErr w:type="spellEnd"/>
+      <w:r>
+        <w:t>.</w:t>
+      </w:r>
+    </w:p>
+    <w:p/>
+    <w:p>
+      <w:r>
+        <w:t>Quiero destacar la prolijidad de tu código.</w:t>
+      </w:r>
+    </w:p>
+    <w:p/>
+    <w:p/>
+    <w:p/>
+    <w:p>
+      <w:r>
         <w:t>Excelente trabajo ¡</w:t>
       </w:r>
     </w:p>
     <w:p/>
     <w:p>
       <w:r>
-        <w:t xml:space="preserve">Tu nota en el Desafío 04 es: </w:t>
+        <w:t xml:space="preserve">Tu nota en el Desafío 05 es: </w:t>
       </w:r>
       <w:r>
         <w:rPr>
@@ -2222,13 +2763,23 @@
           <w:bCs/>
         </w:rPr>
       </w:pPr>
-      <w:r>
-        <w:rPr>
-          <w:rFonts w:ascii="Segoe UI Emoji" w:hAnsi="Segoe UI Emoji" w:cs="Segoe UI Emoji"/>
-          <w:b/>
-          <w:bCs/>
-        </w:rPr>
-        <w:t xml:space="preserve">Zuñiga </w:t>
+      <w:proofErr w:type="spellStart"/>
+      <w:r>
+        <w:rPr>
+          <w:rFonts w:ascii="Segoe UI Emoji" w:hAnsi="Segoe UI Emoji" w:cs="Segoe UI Emoji"/>
+          <w:b/>
+          <w:bCs/>
+        </w:rPr>
+        <w:t>Zuñiga</w:t>
+      </w:r>
+      <w:proofErr w:type="spellEnd"/>
+      <w:r>
+        <w:rPr>
+          <w:rFonts w:ascii="Segoe UI Emoji" w:hAnsi="Segoe UI Emoji" w:cs="Segoe UI Emoji"/>
+          <w:b/>
+          <w:bCs/>
+        </w:rPr>
+        <w:t xml:space="preserve"> </w:t>
       </w:r>
       <w:proofErr w:type="spellStart"/>
       <w:r>
@@ -2508,6 +3059,7 @@
     <w:p/>
     <w:p>
       <w:r>
+        <w:lastRenderedPageBreak/>
         <w:t>Primeramente, quería felicitarte por el trabajo que realizaste. El resultado renderizado es el solicitado.</w:t>
       </w:r>
     </w:p>
@@ -2627,7 +3179,7 @@
       </w:r>
       <w:proofErr w:type="gramEnd"/>
       <w:r>
-        <w:t xml:space="preserve">Felicitaciones por la entrega del Desafío 04! </w:t>
+        <w:t xml:space="preserve">Felicitaciones por la entrega del Desafío 05! </w:t>
       </w:r>
       <w:r>
         <w:rPr>
@@ -2639,87 +3191,116 @@
     <w:p/>
     <w:p>
       <w:r>
-        <w:t>Sofia, muy buen trabajo, te felicito. Destaco la prolijidad de tu proyecto.</w:t>
-      </w:r>
-    </w:p>
-    <w:p/>
-    <w:p>
-      <w:r>
-        <w:t xml:space="preserve">La estructura HTML esta impecable, destaco la correcta implementación de contenedores semánticos como </w:t>
-      </w:r>
-      <w:proofErr w:type="spellStart"/>
-      <w:r>
-        <w:t>main</w:t>
-      </w:r>
-      <w:proofErr w:type="spellEnd"/>
-      <w:r>
-        <w:t xml:space="preserve">, </w:t>
-      </w:r>
-      <w:proofErr w:type="spellStart"/>
-      <w:r>
-        <w:t>section</w:t>
-      </w:r>
-      <w:proofErr w:type="spellEnd"/>
-      <w:r>
-        <w:t xml:space="preserve">, </w:t>
-      </w:r>
-      <w:proofErr w:type="spellStart"/>
-      <w:r>
-        <w:t>footer</w:t>
-      </w:r>
-      <w:proofErr w:type="spellEnd"/>
-      <w:r>
-        <w:t>, etc.</w:t>
-      </w:r>
-    </w:p>
-    <w:p/>
-    <w:p>
-      <w:r>
-        <w:t xml:space="preserve">La implementación de position para superponer el banner quedo perfecto. </w:t>
-      </w:r>
-    </w:p>
-    <w:p/>
-    <w:p>
-      <w:r>
-        <w:t xml:space="preserve">La disposición de elementos en la </w:t>
-      </w:r>
-      <w:proofErr w:type="spellStart"/>
-      <w:r>
-        <w:t>landing</w:t>
-      </w:r>
-      <w:proofErr w:type="spellEnd"/>
-      <w:r>
-        <w:t xml:space="preserve"> page quedo tal cual lo solicitado con la herramienta Flex.</w:t>
-      </w:r>
-    </w:p>
-    <w:p/>
-    <w:p>
-      <w:r>
-        <w:t xml:space="preserve">Correctamente creadas la tabla y recurso de video. </w:t>
-      </w:r>
-    </w:p>
-    <w:p/>
-    <w:p>
-      <w:r>
-        <w:t xml:space="preserve">En los estilos los colores, tipografías y espaciado quedaron ok, falto agregar efectos </w:t>
-      </w:r>
-      <w:proofErr w:type="spellStart"/>
-      <w:r>
-        <w:t>hover</w:t>
-      </w:r>
-      <w:proofErr w:type="spellEnd"/>
-      <w:r>
-        <w:t xml:space="preserve"> en la barra de navegación principal y en las </w:t>
-      </w:r>
-      <w:proofErr w:type="spellStart"/>
-      <w:r>
-        <w:t>cards</w:t>
-      </w:r>
-      <w:proofErr w:type="spellEnd"/>
-      <w:r>
-        <w:t xml:space="preserve"> de productos.</w:t>
-      </w:r>
-    </w:p>
+        <w:t>Sofia</w:t>
+      </w:r>
+      <w:r>
+        <w:t xml:space="preserve">, muy buen trabajo, te felicito por </w:t>
+      </w:r>
+      <w:r>
+        <w:t>el compromiso en realizar las entregas.</w:t>
+      </w:r>
+    </w:p>
+    <w:p/>
+    <w:p>
+      <w:r>
+        <w:t>En cuanto a la implementación de variables “</w:t>
+      </w:r>
+      <w:proofErr w:type="spellStart"/>
+      <w:r>
+        <w:t>let</w:t>
+      </w:r>
+      <w:proofErr w:type="spellEnd"/>
+      <w:r>
+        <w:t>” y “</w:t>
+      </w:r>
+      <w:proofErr w:type="spellStart"/>
+      <w:r>
+        <w:t>const</w:t>
+      </w:r>
+      <w:proofErr w:type="spellEnd"/>
+      <w:r>
+        <w:t>” falto aplicar variables “</w:t>
+      </w:r>
+      <w:proofErr w:type="spellStart"/>
+      <w:r>
+        <w:t>let</w:t>
+      </w:r>
+      <w:proofErr w:type="spellEnd"/>
+      <w:r>
+        <w:t>”, las variables “</w:t>
+      </w:r>
+      <w:proofErr w:type="spellStart"/>
+      <w:r>
+        <w:t>const</w:t>
+      </w:r>
+      <w:proofErr w:type="spellEnd"/>
+      <w:r>
+        <w:t xml:space="preserve">” conceptualmente en estos ejercicios son </w:t>
+      </w:r>
+      <w:r>
+        <w:t>más</w:t>
+      </w:r>
+      <w:r>
+        <w:t xml:space="preserve"> para valores como el “</w:t>
+      </w:r>
+      <w:proofErr w:type="spellStart"/>
+      <w:r>
+        <w:t>iva</w:t>
+      </w:r>
+      <w:proofErr w:type="spellEnd"/>
+      <w:r>
+        <w:t>” que son objetos que quedan permanentes.</w:t>
+      </w:r>
+    </w:p>
+    <w:p/>
+    <w:p>
+      <w:r>
+        <w:t>Manipulaste correctamente los tipos de datos para cada situación y los nombres asignados a variables son descriptivos como se solicitó.</w:t>
+      </w:r>
+    </w:p>
+    <w:p/>
+    <w:p>
+      <w:r>
+        <w:t>Correcto el uso de operadores matemáticos y los resultados guardados en variables.</w:t>
+      </w:r>
+    </w:p>
+    <w:p/>
+    <w:p>
+      <w:r>
+        <w:t xml:space="preserve">Buenísimo que te manejaste con </w:t>
+      </w:r>
+      <w:proofErr w:type="spellStart"/>
+      <w:r>
+        <w:t>template</w:t>
+      </w:r>
+      <w:proofErr w:type="spellEnd"/>
+      <w:r>
+        <w:t xml:space="preserve"> </w:t>
+      </w:r>
+      <w:proofErr w:type="spellStart"/>
+      <w:r>
+        <w:t>literals</w:t>
+      </w:r>
+      <w:proofErr w:type="spellEnd"/>
+      <w:r>
+        <w:t xml:space="preserve"> en lugar de concatenar </w:t>
+      </w:r>
+      <w:proofErr w:type="spellStart"/>
+      <w:r>
+        <w:t>strings</w:t>
+      </w:r>
+      <w:proofErr w:type="spellEnd"/>
+      <w:r>
+        <w:t>.</w:t>
+      </w:r>
+    </w:p>
+    <w:p/>
+    <w:p>
+      <w:r>
+        <w:t>Quiero destacar la prolijidad de tu código.</w:t>
+      </w:r>
+    </w:p>
+    <w:p/>
     <w:p/>
     <w:p/>
     <w:p>
@@ -2730,7 +3311,7 @@
     <w:p/>
     <w:p>
       <w:r>
-        <w:t xml:space="preserve">Tu nota en el Desafío 04 es: </w:t>
+        <w:t xml:space="preserve">Tu nota en el Desafío 05 es: </w:t>
       </w:r>
       <w:r>
         <w:rPr>
@@ -2946,8 +3527,6 @@
     <w:p/>
     <w:p/>
     <w:p/>
-    <w:p/>
-    <w:p/>
     <w:p>
       <w:r>
         <w:t>Excelente trabajo ¡</w:t>
@@ -3025,7 +3604,7 @@
       </w:r>
       <w:proofErr w:type="gramEnd"/>
       <w:r>
-        <w:t xml:space="preserve">Felicitaciones por la entrega del Desafío 04! </w:t>
+        <w:t xml:space="preserve">Felicitaciones por la entrega del Desafío 05! </w:t>
       </w:r>
       <w:r>
         <w:rPr>
@@ -3037,76 +3616,136 @@
     <w:p/>
     <w:p>
       <w:r>
-        <w:t>Micaela, excelente trabajo, te felicito. Destaco la prolijidad de tu proyecto.</w:t>
-      </w:r>
-    </w:p>
-    <w:p/>
-    <w:p>
-      <w:r>
-        <w:t xml:space="preserve">La estructura HTML esta impecable, destaco la correcta implementación de contenedores semánticos como </w:t>
-      </w:r>
-      <w:proofErr w:type="spellStart"/>
-      <w:r>
-        <w:t>main</w:t>
-      </w:r>
-      <w:proofErr w:type="spellEnd"/>
-      <w:r>
-        <w:t xml:space="preserve">, </w:t>
-      </w:r>
-      <w:proofErr w:type="spellStart"/>
-      <w:r>
-        <w:t>section</w:t>
-      </w:r>
-      <w:proofErr w:type="spellEnd"/>
-      <w:r>
-        <w:t xml:space="preserve">, </w:t>
-      </w:r>
-      <w:proofErr w:type="spellStart"/>
-      <w:r>
-        <w:t>footer</w:t>
-      </w:r>
-      <w:proofErr w:type="spellEnd"/>
-      <w:r>
-        <w:t>, etc.</w:t>
-      </w:r>
-    </w:p>
-    <w:p/>
-    <w:p>
-      <w:r>
-        <w:t xml:space="preserve">La implementación de position para superponer el banner quedo perfecto. </w:t>
-      </w:r>
-    </w:p>
-    <w:p/>
-    <w:p>
-      <w:r>
-        <w:t xml:space="preserve">La disposición de elementos en la </w:t>
-      </w:r>
-      <w:proofErr w:type="spellStart"/>
-      <w:r>
-        <w:t>landing</w:t>
-      </w:r>
-      <w:proofErr w:type="spellEnd"/>
-      <w:r>
-        <w:t xml:space="preserve"> page quedo tal cual lo solicitado con la herramienta Flex.</w:t>
-      </w:r>
-    </w:p>
-    <w:p/>
-    <w:p>
-      <w:r>
-        <w:t>Correctamente creadas la tabla y recurso de video. Los estilos tal cual los solicitados en imágenes de referencia.</w:t>
-      </w:r>
-    </w:p>
-    <w:p/>
-    <w:p/>
-    <w:p>
-      <w:r>
-        <w:t>Excelente trabajo ¡</w:t>
-      </w:r>
-    </w:p>
-    <w:p/>
-    <w:p>
-      <w:r>
-        <w:t xml:space="preserve">Tu nota en el Desafío 04 es: </w:t>
+        <w:t>Micaela</w:t>
+      </w:r>
+      <w:r>
+        <w:t>, muy buen trabajo, te felicito por el compromiso en realizar las entregas.</w:t>
+      </w:r>
+    </w:p>
+    <w:p/>
+    <w:p>
+      <w:r>
+        <w:t>La declaración y uso de variables “</w:t>
+      </w:r>
+      <w:proofErr w:type="spellStart"/>
+      <w:r>
+        <w:t>let</w:t>
+      </w:r>
+      <w:proofErr w:type="spellEnd"/>
+      <w:r>
+        <w:t>” y “</w:t>
+      </w:r>
+      <w:proofErr w:type="spellStart"/>
+      <w:r>
+        <w:t>const</w:t>
+      </w:r>
+      <w:proofErr w:type="spellEnd"/>
+      <w:r>
+        <w:t xml:space="preserve">” esta correcta, falto declarar variables con </w:t>
+      </w:r>
+      <w:proofErr w:type="spellStart"/>
+      <w:r>
+        <w:t>let</w:t>
+      </w:r>
+      <w:proofErr w:type="spellEnd"/>
+      <w:r>
+        <w:t xml:space="preserve"> en el documento, si bien en estos ejercicios no </w:t>
+      </w:r>
+      <w:proofErr w:type="spellStart"/>
+      <w:r>
+        <w:t>esta</w:t>
+      </w:r>
+      <w:proofErr w:type="spellEnd"/>
+      <w:r>
+        <w:t xml:space="preserve"> mal usar </w:t>
+      </w:r>
+      <w:proofErr w:type="spellStart"/>
+      <w:r>
+        <w:t>const</w:t>
+      </w:r>
+      <w:proofErr w:type="spellEnd"/>
+      <w:r>
+        <w:t xml:space="preserve"> conceptualmente queda mejor usarlo </w:t>
+      </w:r>
+      <w:r>
+        <w:rPr>
+          <w:u w:val="single"/>
+        </w:rPr>
+        <w:t>para</w:t>
+      </w:r>
+      <w:r>
+        <w:t xml:space="preserve"> objetos como el “</w:t>
+      </w:r>
+      <w:proofErr w:type="spellStart"/>
+      <w:r>
+        <w:t>iva</w:t>
+      </w:r>
+      <w:proofErr w:type="spellEnd"/>
+      <w:r>
+        <w:t>” que son valores que sabemos que son permanentes.</w:t>
+      </w:r>
+    </w:p>
+    <w:p/>
+    <w:p>
+      <w:r>
+        <w:t xml:space="preserve">Manipulaste correctamente los tipos de datos para cada situación y los nombres asignados a variables son descriptivos como se </w:t>
+      </w:r>
+      <w:proofErr w:type="spellStart"/>
+      <w:r>
+        <w:t>solicito</w:t>
+      </w:r>
+      <w:proofErr w:type="spellEnd"/>
+      <w:r>
+        <w:t>.</w:t>
+      </w:r>
+    </w:p>
+    <w:p/>
+    <w:p>
+      <w:r>
+        <w:t>Correcto el uso de operadores matemáticos y los resultados guardados en variables.</w:t>
+      </w:r>
+    </w:p>
+    <w:p/>
+    <w:p>
+      <w:r>
+        <w:t xml:space="preserve">Correctamente implementado los </w:t>
+      </w:r>
+      <w:proofErr w:type="spellStart"/>
+      <w:r>
+        <w:t>template</w:t>
+      </w:r>
+      <w:proofErr w:type="spellEnd"/>
+      <w:r>
+        <w:t xml:space="preserve"> </w:t>
+      </w:r>
+      <w:proofErr w:type="spellStart"/>
+      <w:r>
+        <w:t>strings</w:t>
+      </w:r>
+      <w:proofErr w:type="spellEnd"/>
+      <w:r>
+        <w:t>.</w:t>
+      </w:r>
+    </w:p>
+    <w:p/>
+    <w:p/>
+    <w:p>
+      <w:r>
+        <w:t>Quiero destacar la prolijidad de tu código.</w:t>
+      </w:r>
+    </w:p>
+    <w:p/>
+    <w:p/>
+    <w:p/>
+    <w:p>
+      <w:r>
+        <w:t>Muy buen trabajo ¡</w:t>
+      </w:r>
+    </w:p>
+    <w:p/>
+    <w:p>
+      <w:r>
+        <w:t xml:space="preserve">Tu nota en el Desafío 05 es: </w:t>
       </w:r>
       <w:r>
         <w:rPr>
@@ -3309,7 +3948,25 @@
           <w:b/>
           <w:bCs/>
         </w:rPr>
-        <w:t xml:space="preserve"> Bernardis Juan Manuel</w:t>
+        <w:t xml:space="preserve"> </w:t>
+      </w:r>
+      <w:proofErr w:type="spellStart"/>
+      <w:r>
+        <w:rPr>
+          <w:rFonts w:ascii="Segoe UI Emoji" w:hAnsi="Segoe UI Emoji" w:cs="Segoe UI Emoji"/>
+          <w:b/>
+          <w:bCs/>
+        </w:rPr>
+        <w:t>Bernardis</w:t>
+      </w:r>
+      <w:proofErr w:type="spellEnd"/>
+      <w:r>
+        <w:rPr>
+          <w:rFonts w:ascii="Segoe UI Emoji" w:hAnsi="Segoe UI Emoji" w:cs="Segoe UI Emoji"/>
+          <w:b/>
+          <w:bCs/>
+        </w:rPr>
+        <w:t xml:space="preserve"> Juan Manuel</w:t>
       </w:r>
     </w:p>
     <w:p>
@@ -3351,13 +4008,13 @@
     <w:p/>
     <w:p>
       <w:r>
+        <w:lastRenderedPageBreak/>
         <w:t>Juan Manuel, excelente trabajo, te felicito. Destaco la prolijidad de tu proyecto.</w:t>
       </w:r>
     </w:p>
     <w:p/>
     <w:p>
       <w:r>
-        <w:lastRenderedPageBreak/>
         <w:t xml:space="preserve">La estructura HTML esta impecable, destaco la correcta implementación de contenedores semánticos como </w:t>
       </w:r>
       <w:proofErr w:type="spellStart"/>
@@ -3553,6 +4210,7 @@
     <w:p/>
     <w:p>
       <w:r>
+        <w:lastRenderedPageBreak/>
         <w:t xml:space="preserve">En la parte del banner para que quede como en las imágenes de referencias iría </w:t>
       </w:r>
       <w:proofErr w:type="spellStart"/>
@@ -3597,7 +4255,6 @@
     <w:p>
       <w:proofErr w:type="spellStart"/>
       <w:r>
-        <w:lastRenderedPageBreak/>
         <w:t>Recordá</w:t>
       </w:r>
       <w:proofErr w:type="spellEnd"/>
@@ -3688,7 +4345,7 @@
 </file>
 
 <file path=word/numbering.xml><?xml version="1.0" encoding="utf-8"?>
-<w:numbering xmlns:wpc="http://schemas.microsoft.com/office/word/2010/wordprocessingCanvas" xmlns:cx="http://schemas.microsoft.com/office/drawing/2014/chartex" xmlns:cx1="http://schemas.microsoft.com/office/drawing/2015/9/8/chartex" xmlns:cx2="http://schemas.microsoft.com/office/drawing/2015/10/21/chartex" xmlns:cx3="http://schemas.microsoft.com/office/drawing/2016/5/9/chartex" xmlns:cx4="http://schemas.microsoft.com/office/drawing/2016/5/10/chartex" xmlns:cx5="http://schemas.microsoft.com/office/drawing/2016/5/11/chartex" xmlns:cx6="http://schemas.microsoft.com/office/drawing/2016/5/12/chartex" xmlns:cx7="http://schemas.microsoft.com/office/drawing/2016/5/13/chartex" xmlns:cx8="http://schemas.microsoft.com/office/drawing/2016/5/14/chartex" xmlns:mc="http://schemas.openxmlformats.org/markup-compatibility/2006" xmlns:aink="http://schemas.microsoft.com/office/drawing/2016/ink" xmlns:am3d="http://schemas.microsoft.com/office/drawing/2017/model3d" xmlns:o="urn:schemas-microsoft-com:office:office" xmlns:oel="http://schemas.microsoft.com/office/2019/extlst" xmlns:r="http://schemas.openxmlformats.org/officeDocument/2006/relationships" xmlns:m="http://schemas.openxmlformats.org/officeDocument/2006/math" xmlns:v="urn:schemas-microsoft-com:vml" xmlns:wp14="http://schemas.microsoft.com/office/word/2010/wordprocessingDrawing" xmlns:wp="http://schemas.openxmlformats.org/drawingml/2006/wordprocessingDrawing" xmlns:w10="urn:schemas-microsoft-com:office:word" xmlns:w="http://schemas.openxmlformats.org/wordprocessingml/2006/main" xmlns:w14="http://schemas.microsoft.com/office/word/2010/wordml" xmlns:w15="http://schemas.microsoft.com/office/word/2012/wordml" xmlns:w16cex="http://schemas.microsoft.com/office/word/2018/wordml/cex" xmlns:w16cid="http://schemas.microsoft.com/office/word/2016/wordml/cid" xmlns:w16="http://schemas.microsoft.com/office/word/2018/wordml" xmlns:w16du="http://schemas.microsoft.com/office/word/2023/wordml/word16du" xmlns:w16sdtdh="http://schemas.microsoft.com/office/word/2020/wordml/sdtdatahash" xmlns:w16sdtfl="http://schemas.microsoft.com/office/word/2024/wordml/sdtformatlock" xmlns:w16se="http://schemas.microsoft.com/office/word/2015/wordml/symex" xmlns:wpg="http://schemas.microsoft.com/office/word/2010/wordprocessingGroup" xmlns:wpi="http://schemas.microsoft.com/office/word/2010/wordprocessingInk" xmlns:wne="http://schemas.microsoft.com/office/word/2006/wordml" xmlns:wps="http://schemas.microsoft.com/office/word/2010/wordprocessingShape" mc:Ignorable="w14 w15 w16se w16cid w16 w16cex w16sdtdh w16sdtfl w16du wp14">
+<w:numbering xmlns:wpc="http://schemas.microsoft.com/office/word/2010/wordprocessingCanvas" xmlns:cx="http://schemas.microsoft.com/office/drawing/2014/chartex" xmlns:cx1="http://schemas.microsoft.com/office/drawing/2015/9/8/chartex" xmlns:cx2="http://schemas.microsoft.com/office/drawing/2015/10/21/chartex" xmlns:cx3="http://schemas.microsoft.com/office/drawing/2016/5/9/chartex" xmlns:cx4="http://schemas.microsoft.com/office/drawing/2016/5/10/chartex" xmlns:cx5="http://schemas.microsoft.com/office/drawing/2016/5/11/chartex" xmlns:cx6="http://schemas.microsoft.com/office/drawing/2016/5/12/chartex" xmlns:cx7="http://schemas.microsoft.com/office/drawing/2016/5/13/chartex" xmlns:cx8="http://schemas.microsoft.com/office/drawing/2016/5/14/chartex" xmlns:mc="http://schemas.openxmlformats.org/markup-compatibility/2006" xmlns:aink="http://schemas.microsoft.com/office/drawing/2016/ink" xmlns:am3d="http://schemas.microsoft.com/office/drawing/2017/model3d" xmlns:o="urn:schemas-microsoft-com:office:office" xmlns:oel="http://schemas.microsoft.com/office/2019/extlst" xmlns:r="http://schemas.openxmlformats.org/officeDocument/2006/relationships" xmlns:m="http://schemas.openxmlformats.org/officeDocument/2006/math" xmlns:v="urn:schemas-microsoft-com:vml" xmlns:wp14="http://schemas.microsoft.com/office/word/2010/wordprocessingDrawing" xmlns:wp="http://schemas.openxmlformats.org/drawingml/2006/wordprocessingDrawing" xmlns:w10="urn:schemas-microsoft-com:office:word" xmlns:w="http://schemas.openxmlformats.org/wordprocessingml/2006/main" xmlns:w14="http://schemas.microsoft.com/office/word/2010/wordml" xmlns:w15="http://schemas.microsoft.com/office/word/2012/wordml" xmlns:w16cex="http://schemas.microsoft.com/office/word/2018/wordml/cex" xmlns:w16cid="http://schemas.microsoft.com/office/word/2016/wordml/cid" xmlns:w16="http://schemas.microsoft.com/office/word/2018/wordml" xmlns:w16sdtdh="http://schemas.microsoft.com/office/word/2020/wordml/sdtdatahash" xmlns:w16se="http://schemas.microsoft.com/office/word/2015/wordml/symex" xmlns:wpg="http://schemas.microsoft.com/office/word/2010/wordprocessingGroup" xmlns:wpi="http://schemas.microsoft.com/office/word/2010/wordprocessingInk" xmlns:wne="http://schemas.microsoft.com/office/word/2006/wordml" xmlns:wps="http://schemas.microsoft.com/office/word/2010/wordprocessingShape" mc:Ignorable="w14 w15 w16se w16cid w16 w16cex w16sdtdh wp14">
   <w:abstractNum w:abstractNumId="0" w15:restartNumberingAfterBreak="0">
     <w:nsid w:val="14BF2A4A"/>
     <w:multiLevelType w:val="hybridMultilevel"/>
@@ -4041,7 +4698,7 @@
 </file>
 
 <file path=word/styles.xml><?xml version="1.0" encoding="utf-8"?>
-<w:styles xmlns:mc="http://schemas.openxmlformats.org/markup-compatibility/2006" xmlns:r="http://schemas.openxmlformats.org/officeDocument/2006/relationships" xmlns:w="http://schemas.openxmlformats.org/wordprocessingml/2006/main" xmlns:w14="http://schemas.microsoft.com/office/word/2010/wordml" xmlns:w15="http://schemas.microsoft.com/office/word/2012/wordml" xmlns:w16cex="http://schemas.microsoft.com/office/word/2018/wordml/cex" xmlns:w16cid="http://schemas.microsoft.com/office/word/2016/wordml/cid" xmlns:w16="http://schemas.microsoft.com/office/word/2018/wordml" xmlns:w16du="http://schemas.microsoft.com/office/word/2023/wordml/word16du" xmlns:w16sdtdh="http://schemas.microsoft.com/office/word/2020/wordml/sdtdatahash" xmlns:w16sdtfl="http://schemas.microsoft.com/office/word/2024/wordml/sdtformatlock" xmlns:w16se="http://schemas.microsoft.com/office/word/2015/wordml/symex" mc:Ignorable="w14 w15 w16se w16cid w16 w16cex w16sdtdh w16sdtfl w16du">
+<w:styles xmlns:mc="http://schemas.openxmlformats.org/markup-compatibility/2006" xmlns:r="http://schemas.openxmlformats.org/officeDocument/2006/relationships" xmlns:w="http://schemas.openxmlformats.org/wordprocessingml/2006/main" xmlns:w14="http://schemas.microsoft.com/office/word/2010/wordml" xmlns:w15="http://schemas.microsoft.com/office/word/2012/wordml" xmlns:w16cex="http://schemas.microsoft.com/office/word/2018/wordml/cex" xmlns:w16cid="http://schemas.microsoft.com/office/word/2016/wordml/cid" xmlns:w16="http://schemas.microsoft.com/office/word/2018/wordml" xmlns:w16sdtdh="http://schemas.microsoft.com/office/word/2020/wordml/sdtdatahash" xmlns:w16se="http://schemas.microsoft.com/office/word/2015/wordml/symex" mc:Ignorable="w14 w15 w16se w16cid w16 w16cex w16sdtdh">
   <w:docDefaults>
     <w:rPrDefault>
       <w:rPr>
@@ -4447,7 +5104,6 @@
   <w:style w:type="character" w:default="1" w:styleId="Fuentedeprrafopredeter">
     <w:name w:val="Default Paragraph Font"/>
     <w:uiPriority w:val="1"/>
-    <w:semiHidden/>
     <w:unhideWhenUsed/>
   </w:style>
   <w:style w:type="table" w:default="1" w:styleId="Tablanormal">
@@ -4778,4 +5434,16 @@
     </a:ext>
   </a:extLst>
 </a:theme>
+</file>
+
+<file path=customXml/item1.xml><?xml version="1.0" encoding="utf-8"?>
+<b:Sources xmlns:b="http://schemas.openxmlformats.org/officeDocument/2006/bibliography" xmlns="http://schemas.openxmlformats.org/officeDocument/2006/bibliography" SelectedStyle="\APASixthEditionOfficeOnline.xsl" StyleName="APA" Version="6"/>
+</file>
+
+<file path=customXml/itemProps1.xml><?xml version="1.0" encoding="utf-8"?>
+<ds:datastoreItem xmlns:ds="http://schemas.openxmlformats.org/officeDocument/2006/customXml" ds:itemID="{93BC9730-96CD-4F14-A813-73AAE1EA1EB0}">
+  <ds:schemaRefs>
+    <ds:schemaRef ds:uri="http://schemas.openxmlformats.org/officeDocument/2006/bibliography"/>
+  </ds:schemaRefs>
+</ds:datastoreItem>
 </file>
</xml_diff>

<commit_message>
Correccion 05 - Pousadas OK
</commit_message>
<xml_diff>
--- a/Practicos/Notas y Devoluciones 05.docx
+++ b/Practicos/Notas y Devoluciones 05.docx
@@ -4,7 +4,7 @@
   <w:body>
     <w:p>
       <w:pPr>
-        <w:ind w:left="3540" w:hanging="3540"/>
+        <w:ind w:left="4248" w:hanging="4248"/>
         <w:rPr>
           <w:rFonts w:ascii="Segoe UI Emoji" w:hAnsi="Segoe UI Emoji" w:cs="Segoe UI Emoji"/>
           <w:b/>
@@ -59,10 +59,7 @@
     <w:p/>
     <w:p>
       <w:r>
-        <w:t>Facundo</w:t>
-      </w:r>
-      <w:r>
-        <w:t>, muy buen trabajo, te felicito</w:t>
+        <w:t>Facundo, muy buen trabajo, te felicito</w:t>
       </w:r>
     </w:p>
     <w:p/>
@@ -84,10 +81,7 @@
       </w:r>
       <w:proofErr w:type="spellEnd"/>
       <w:r>
-        <w:t xml:space="preserve"> esta correcta</w:t>
-      </w:r>
-      <w:r>
-        <w:t xml:space="preserve">. </w:t>
+        <w:t xml:space="preserve"> esta correcta. </w:t>
       </w:r>
     </w:p>
     <w:p/>
@@ -274,10 +268,7 @@
     <w:p/>
     <w:p>
       <w:r>
-        <w:t>Diego</w:t>
-      </w:r>
-      <w:r>
-        <w:t xml:space="preserve">, </w:t>
+        <w:t xml:space="preserve">Diego, </w:t>
       </w:r>
       <w:r>
         <w:t>excelente</w:t>
@@ -320,7 +311,15 @@
       </w:r>
       <w:proofErr w:type="spellEnd"/>
       <w:r>
-        <w:t>, como pro ejemplo con datos como el “</w:t>
+        <w:t xml:space="preserve">, como </w:t>
+      </w:r>
+      <w:proofErr w:type="spellStart"/>
+      <w:r>
+        <w:t>pro</w:t>
+      </w:r>
+      <w:proofErr w:type="spellEnd"/>
+      <w:r>
+        <w:t xml:space="preserve"> ejemplo con datos como el “</w:t>
       </w:r>
       <w:proofErr w:type="spellStart"/>
       <w:r>
@@ -476,10 +475,7 @@
       </w:r>
       <w:proofErr w:type="spellEnd"/>
       <w:r>
-        <w:t>, muy buen trabajo, te felicito</w:t>
-      </w:r>
-      <w:r>
-        <w:t xml:space="preserve"> por el compromiso en realizar las entregas.</w:t>
+        <w:t>, muy buen trabajo, te felicito por el compromiso en realizar las entregas.</w:t>
       </w:r>
     </w:p>
     <w:p/>
@@ -501,10 +497,7 @@
       </w:r>
       <w:proofErr w:type="spellEnd"/>
       <w:r>
-        <w:t xml:space="preserve"> esta correcta</w:t>
-      </w:r>
-      <w:r>
-        <w:t xml:space="preserve">. Lastima no pudiste realizar el ejercicio </w:t>
+        <w:t xml:space="preserve"> esta correcta. Lastima no pudiste realizar el ejercicio </w:t>
       </w:r>
       <w:proofErr w:type="spellStart"/>
       <w:r>
@@ -679,13 +672,7 @@
     <w:p/>
     <w:p>
       <w:r>
-        <w:t>Santiago</w:t>
-      </w:r>
-      <w:r>
-        <w:t>, muy buen trabajo, te felicito</w:t>
-      </w:r>
-      <w:r>
-        <w:t xml:space="preserve"> por el compromiso en realizar las entregas.</w:t>
+        <w:t>Santiago, muy buen trabajo, te felicito por el compromiso en realizar las entregas.</w:t>
       </w:r>
     </w:p>
     <w:p/>
@@ -707,10 +694,7 @@
       </w:r>
       <w:proofErr w:type="spellEnd"/>
       <w:r>
-        <w:t xml:space="preserve"> esta correcta</w:t>
-      </w:r>
-      <w:r>
-        <w:t>.</w:t>
+        <w:t xml:space="preserve"> esta correcta.</w:t>
       </w:r>
     </w:p>
     <w:p/>
@@ -898,10 +882,7 @@
       </w:r>
       <w:proofErr w:type="spellEnd"/>
       <w:r>
-        <w:t>” esta</w:t>
-      </w:r>
-      <w:r>
-        <w:t xml:space="preserve"> correcta, falto declarar variables con </w:t>
+        <w:t xml:space="preserve">” esta correcta, falto declarar variables con </w:t>
       </w:r>
       <w:proofErr w:type="spellStart"/>
       <w:r>
@@ -1277,10 +1258,7 @@
     <w:p/>
     <w:p>
       <w:r>
-        <w:t>Carlos</w:t>
-      </w:r>
-      <w:r>
-        <w:t>, muy buen trabajo, te felicito por el compromiso en realizar las entregas.</w:t>
+        <w:t>Carlos, muy buen trabajo, te felicito por el compromiso en realizar las entregas.</w:t>
       </w:r>
     </w:p>
     <w:p/>
@@ -1473,29 +1451,14 @@
     <w:p/>
     <w:p>
       <w:r>
-        <w:t>Gianluca</w:t>
-      </w:r>
-      <w:r>
-        <w:t xml:space="preserve">, </w:t>
-      </w:r>
-      <w:r>
-        <w:t>excelente</w:t>
-      </w:r>
-      <w:r>
-        <w:t xml:space="preserve"> trabajo, te felicito</w:t>
-      </w:r>
-      <w:r>
-        <w:t>.</w:t>
+        <w:t>Gianluca, excelente trabajo, te felicito.</w:t>
       </w:r>
     </w:p>
     <w:p/>
     <w:p>
       <w:r>
         <w:lastRenderedPageBreak/>
-        <w:t xml:space="preserve">La declaración y uso de variables </w:t>
-      </w:r>
-      <w:r>
-        <w:t>“</w:t>
+        <w:t>La declaración y uso de variables “</w:t>
       </w:r>
       <w:proofErr w:type="spellStart"/>
       <w:r>
@@ -1503,13 +1466,7 @@
       </w:r>
       <w:proofErr w:type="spellEnd"/>
       <w:r>
-        <w:t>”</w:t>
-      </w:r>
-      <w:r>
-        <w:t xml:space="preserve"> y </w:t>
-      </w:r>
-      <w:r>
-        <w:t>“</w:t>
+        <w:t>” y “</w:t>
       </w:r>
       <w:proofErr w:type="spellStart"/>
       <w:r>
@@ -1517,24 +1474,12 @@
       </w:r>
       <w:proofErr w:type="spellEnd"/>
       <w:r>
-        <w:t>”</w:t>
-      </w:r>
-      <w:r>
-        <w:t xml:space="preserve"> </w:t>
-      </w:r>
-      <w:r>
-        <w:t>impecable, separaste correctamente cuando utilizar cada uno.</w:t>
-      </w:r>
-    </w:p>
-    <w:p>
-      <w:r>
-        <w:t xml:space="preserve">Manipulaste correctamente los tipos de datos para cada situación y los nombres asignados a variables son descriptivos como se </w:t>
-      </w:r>
-      <w:r>
-        <w:t>solicitó</w:t>
-      </w:r>
-      <w:r>
-        <w:t>.</w:t>
+        <w:t>” impecable, separaste correctamente cuando utilizar cada uno.</w:t>
+      </w:r>
+    </w:p>
+    <w:p>
+      <w:r>
+        <w:t>Manipulaste correctamente los tipos de datos para cada situación y los nombres asignados a variables son descriptivos como se solicitó.</w:t>
       </w:r>
     </w:p>
     <w:p/>
@@ -1719,22 +1664,13 @@
     <w:p/>
     <w:p>
       <w:r>
-        <w:t>Santino</w:t>
-      </w:r>
-      <w:r>
-        <w:t>, muy buen trabajo, te felicito</w:t>
-      </w:r>
-      <w:r>
-        <w:t xml:space="preserve"> por el compromiso en realizar las entregas.</w:t>
-      </w:r>
-    </w:p>
-    <w:p/>
-    <w:p>
-      <w:r>
-        <w:t xml:space="preserve">La declaración y uso de variables </w:t>
-      </w:r>
-      <w:r>
-        <w:t>“</w:t>
+        <w:t>Santino, muy buen trabajo, te felicito por el compromiso en realizar las entregas.</w:t>
+      </w:r>
+    </w:p>
+    <w:p/>
+    <w:p>
+      <w:r>
+        <w:t>La declaración y uso de variables “</w:t>
       </w:r>
       <w:proofErr w:type="spellStart"/>
       <w:r>
@@ -1742,13 +1678,7 @@
       </w:r>
       <w:proofErr w:type="spellEnd"/>
       <w:r>
-        <w:t>”</w:t>
-      </w:r>
-      <w:r>
-        <w:t xml:space="preserve"> y </w:t>
-      </w:r>
-      <w:r>
-        <w:t>“</w:t>
+        <w:t>” y “</w:t>
       </w:r>
       <w:proofErr w:type="spellStart"/>
       <w:r>
@@ -1756,13 +1686,7 @@
       </w:r>
       <w:proofErr w:type="spellEnd"/>
       <w:r>
-        <w:t>”</w:t>
-      </w:r>
-      <w:r>
-        <w:t xml:space="preserve"> esta </w:t>
-      </w:r>
-      <w:r>
-        <w:t>impecable.</w:t>
+        <w:t>” esta impecable.</w:t>
       </w:r>
     </w:p>
     <w:p/>
@@ -1946,22 +1870,13 @@
       </w:r>
       <w:proofErr w:type="spellEnd"/>
       <w:r>
-        <w:t>, muy buen trabajo, te felicito</w:t>
-      </w:r>
-      <w:r>
-        <w:t xml:space="preserve"> por la entrega.</w:t>
-      </w:r>
-    </w:p>
-    <w:p/>
-    <w:p>
-      <w:r>
-        <w:t>En cuanto a la implementación</w:t>
-      </w:r>
-      <w:r>
-        <w:t xml:space="preserve"> de variables </w:t>
-      </w:r>
-      <w:r>
-        <w:t>“</w:t>
+        <w:t>, muy buen trabajo, te felicito por la entrega.</w:t>
+      </w:r>
+    </w:p>
+    <w:p/>
+    <w:p>
+      <w:r>
+        <w:t>En cuanto a la implementación de variables “</w:t>
       </w:r>
       <w:proofErr w:type="spellStart"/>
       <w:r>
@@ -1969,13 +1884,7 @@
       </w:r>
       <w:proofErr w:type="spellEnd"/>
       <w:r>
-        <w:t>”</w:t>
-      </w:r>
-      <w:r>
-        <w:t xml:space="preserve"> y </w:t>
-      </w:r>
-      <w:r>
-        <w:t>“</w:t>
+        <w:t>” y “</w:t>
       </w:r>
       <w:proofErr w:type="spellStart"/>
       <w:r>
@@ -2151,10 +2060,7 @@
     <w:p/>
     <w:p>
       <w:r>
-        <w:t>Tomas</w:t>
-      </w:r>
-      <w:r>
-        <w:t>, muy buen trabajo, te felicito por el compromiso en realizar las entregas.</w:t>
+        <w:t>Tomas, muy buen trabajo, te felicito por el compromiso en realizar las entregas.</w:t>
       </w:r>
     </w:p>
     <w:p/>
@@ -2244,14 +2150,11 @@
     <w:p>
       <w:r>
         <w:lastRenderedPageBreak/>
-        <w:t>Recomiendo usar</w:t>
-      </w:r>
-      <w:r>
-        <w:t xml:space="preserve"> tem</w:t>
-      </w:r>
-      <w:proofErr w:type="spellStart"/>
-      <w:r>
-        <w:t>plate</w:t>
+        <w:t xml:space="preserve">Recomiendo usar </w:t>
+      </w:r>
+      <w:proofErr w:type="spellStart"/>
+      <w:r>
+        <w:t>template</w:t>
       </w:r>
       <w:proofErr w:type="spellEnd"/>
       <w:r>
@@ -2279,13 +2182,7 @@
       </w:r>
       <w:proofErr w:type="spellEnd"/>
       <w:r>
-        <w:t xml:space="preserve"> </w:t>
-      </w:r>
-      <w:r>
-        <w:t>7</w:t>
-      </w:r>
-      <w:r>
-        <w:t xml:space="preserve"> </w:t>
+        <w:t xml:space="preserve"> 7 </w:t>
       </w:r>
       <w:proofErr w:type="spellStart"/>
       <w:r>
@@ -2420,13 +2317,7 @@
     <w:p/>
     <w:p>
       <w:r>
-        <w:t>Ariana</w:t>
-      </w:r>
-      <w:r>
-        <w:t>, muy buen trabajo, te felicito</w:t>
-      </w:r>
-      <w:r>
-        <w:t xml:space="preserve"> por el compromiso en realizar las entregas.</w:t>
+        <w:t>Ariana, muy buen trabajo, te felicito por el compromiso en realizar las entregas.</w:t>
       </w:r>
     </w:p>
     <w:p/>
@@ -2448,10 +2339,7 @@
       </w:r>
       <w:proofErr w:type="spellEnd"/>
       <w:r>
-        <w:t xml:space="preserve"> esta correcta</w:t>
-      </w:r>
-      <w:r>
-        <w:t xml:space="preserve">, eso es </w:t>
+        <w:t xml:space="preserve"> esta correcta, eso es </w:t>
       </w:r>
       <w:proofErr w:type="spellStart"/>
       <w:r>
@@ -2615,10 +2503,7 @@
     <w:p/>
     <w:p>
       <w:r>
-        <w:t>Franco</w:t>
-      </w:r>
-      <w:r>
-        <w:t>, muy buen trabajo, te felicito</w:t>
+        <w:t>Franco, muy buen trabajo, te felicito</w:t>
       </w:r>
     </w:p>
     <w:p/>
@@ -2656,25 +2541,13 @@
       </w:r>
       <w:proofErr w:type="spellEnd"/>
       <w:r>
-        <w:t xml:space="preserve"> manejarlo como una constante </w:t>
-      </w:r>
-      <w:r>
-        <w:t>también</w:t>
-      </w:r>
-      <w:r>
-        <w:t>.</w:t>
-      </w:r>
-    </w:p>
-    <w:p/>
-    <w:p>
-      <w:r>
-        <w:t xml:space="preserve">Manipulaste correctamente los tipos de datos para cada situación y los nombres asignados a variables son descriptivos como se </w:t>
-      </w:r>
-      <w:r>
-        <w:t>solicitó</w:t>
-      </w:r>
-      <w:r>
-        <w:t>.</w:t>
+        <w:t xml:space="preserve"> manejarlo como una constante también.</w:t>
+      </w:r>
+    </w:p>
+    <w:p/>
+    <w:p>
+      <w:r>
+        <w:t>Manipulaste correctamente los tipos de datos para cada situación y los nombres asignados a variables son descriptivos como se solicitó.</w:t>
       </w:r>
     </w:p>
     <w:p/>
@@ -3191,13 +3064,7 @@
     <w:p/>
     <w:p>
       <w:r>
-        <w:t>Sofia</w:t>
-      </w:r>
-      <w:r>
-        <w:t xml:space="preserve">, muy buen trabajo, te felicito por </w:t>
-      </w:r>
-      <w:r>
-        <w:t>el compromiso en realizar las entregas.</w:t>
+        <w:t>Sofia, muy buen trabajo, te felicito por el compromiso en realizar las entregas.</w:t>
       </w:r>
     </w:p>
     <w:p/>
@@ -3235,13 +3102,7 @@
       </w:r>
       <w:proofErr w:type="spellEnd"/>
       <w:r>
-        <w:t xml:space="preserve">” conceptualmente en estos ejercicios son </w:t>
-      </w:r>
-      <w:r>
-        <w:t>más</w:t>
-      </w:r>
-      <w:r>
-        <w:t xml:space="preserve"> para valores como el “</w:t>
+        <w:t>” conceptualmente en estos ejercicios son más para valores como el “</w:t>
       </w:r>
       <w:proofErr w:type="spellStart"/>
       <w:r>
@@ -3616,10 +3477,7 @@
     <w:p/>
     <w:p>
       <w:r>
-        <w:t>Micaela</w:t>
-      </w:r>
-      <w:r>
-        <w:t>, muy buen trabajo, te felicito por el compromiso en realizar las entregas.</w:t>
+        <w:t>Micaela, muy buen trabajo, te felicito por el compromiso en realizar las entregas.</w:t>
       </w:r>
     </w:p>
     <w:p/>
@@ -3996,7 +3854,7 @@
       </w:r>
       <w:proofErr w:type="gramEnd"/>
       <w:r>
-        <w:t xml:space="preserve">Felicitaciones por la entrega del Desafío 04! </w:t>
+        <w:t xml:space="preserve">Felicitaciones por la entrega del Desafío 05! </w:t>
       </w:r>
       <w:r>
         <w:rPr>
@@ -4009,85 +3867,86 @@
     <w:p>
       <w:r>
         <w:lastRenderedPageBreak/>
-        <w:t>Juan Manuel, excelente trabajo, te felicito. Destaco la prolijidad de tu proyecto.</w:t>
-      </w:r>
-    </w:p>
-    <w:p/>
-    <w:p>
-      <w:r>
-        <w:t xml:space="preserve">La estructura HTML esta impecable, destaco la correcta implementación de contenedores semánticos como </w:t>
-      </w:r>
-      <w:proofErr w:type="spellStart"/>
-      <w:r>
-        <w:t>main</w:t>
-      </w:r>
-      <w:proofErr w:type="spellEnd"/>
-      <w:r>
-        <w:t xml:space="preserve">, </w:t>
-      </w:r>
-      <w:proofErr w:type="spellStart"/>
-      <w:r>
-        <w:t>section</w:t>
-      </w:r>
-      <w:proofErr w:type="spellEnd"/>
-      <w:r>
-        <w:t xml:space="preserve">, </w:t>
-      </w:r>
-      <w:proofErr w:type="spellStart"/>
-      <w:r>
-        <w:t>footer</w:t>
-      </w:r>
-      <w:proofErr w:type="spellEnd"/>
-      <w:r>
-        <w:t>, etc.</w:t>
-      </w:r>
-    </w:p>
-    <w:p/>
-    <w:p>
-      <w:r>
-        <w:t xml:space="preserve">La implementación de position para superponer el banner quedo perfecto. </w:t>
-      </w:r>
-    </w:p>
-    <w:p/>
-    <w:p>
-      <w:r>
-        <w:t xml:space="preserve">La disposición de elementos en la </w:t>
-      </w:r>
-      <w:proofErr w:type="spellStart"/>
-      <w:r>
-        <w:t>landing</w:t>
-      </w:r>
-      <w:proofErr w:type="spellEnd"/>
-      <w:r>
-        <w:t xml:space="preserve"> page quedo tal cual lo solicitado con la herramienta Flex.</w:t>
-      </w:r>
-    </w:p>
-    <w:p/>
-    <w:p>
-      <w:r>
-        <w:t xml:space="preserve">Correctamente creadas la tabla y recurso de video. </w:t>
-      </w:r>
-    </w:p>
-    <w:p/>
-    <w:p>
-      <w:r>
-        <w:t xml:space="preserve">En los estilos los colores, tipografías y espaciado quedaron ok, falto agregar efectos </w:t>
-      </w:r>
-      <w:proofErr w:type="spellStart"/>
-      <w:r>
-        <w:t>hover</w:t>
-      </w:r>
-      <w:proofErr w:type="spellEnd"/>
-      <w:r>
-        <w:t xml:space="preserve"> en la barra de navegación principal y en las </w:t>
-      </w:r>
-      <w:proofErr w:type="spellStart"/>
-      <w:r>
-        <w:t>cards</w:t>
-      </w:r>
-      <w:proofErr w:type="spellEnd"/>
-      <w:r>
-        <w:t xml:space="preserve"> de productos.</w:t>
+        <w:t>Juan</w:t>
+      </w:r>
+      <w:r>
+        <w:t>, muy buen trabajo, te felicito</w:t>
+      </w:r>
+      <w:r>
+        <w:t xml:space="preserve"> por el compromiso en realizar las entregas.</w:t>
+      </w:r>
+    </w:p>
+    <w:p/>
+    <w:p>
+      <w:r>
+        <w:t xml:space="preserve">La declaración y uso de variables </w:t>
+      </w:r>
+      <w:proofErr w:type="spellStart"/>
+      <w:r>
+        <w:t>let</w:t>
+      </w:r>
+      <w:proofErr w:type="spellEnd"/>
+      <w:r>
+        <w:t xml:space="preserve"> y </w:t>
+      </w:r>
+      <w:proofErr w:type="spellStart"/>
+      <w:r>
+        <w:t>const</w:t>
+      </w:r>
+      <w:proofErr w:type="spellEnd"/>
+      <w:r>
+        <w:t xml:space="preserve"> esta correcta</w:t>
+      </w:r>
+      <w:r>
+        <w:t>.</w:t>
+      </w:r>
+    </w:p>
+    <w:p/>
+    <w:p>
+      <w:r>
+        <w:t>Manipulaste correctamente los tipos de datos para cada situación y los nombres asignados a variables son descriptivos como se solicitó.</w:t>
+      </w:r>
+    </w:p>
+    <w:p/>
+    <w:p>
+      <w:r>
+        <w:t>Correcto el uso de operadores matemáticos y los resultados guardados en variables.</w:t>
+      </w:r>
+    </w:p>
+    <w:p/>
+    <w:p>
+      <w:r>
+        <w:t xml:space="preserve">Buenísimo que te manejaste con </w:t>
+      </w:r>
+      <w:proofErr w:type="spellStart"/>
+      <w:r>
+        <w:t>template</w:t>
+      </w:r>
+      <w:proofErr w:type="spellEnd"/>
+      <w:r>
+        <w:t xml:space="preserve"> </w:t>
+      </w:r>
+      <w:proofErr w:type="spellStart"/>
+      <w:r>
+        <w:t>literals</w:t>
+      </w:r>
+      <w:proofErr w:type="spellEnd"/>
+      <w:r>
+        <w:t xml:space="preserve"> en lugar de concatenar </w:t>
+      </w:r>
+      <w:proofErr w:type="spellStart"/>
+      <w:r>
+        <w:t>strings</w:t>
+      </w:r>
+      <w:proofErr w:type="spellEnd"/>
+      <w:r>
+        <w:t>.</w:t>
+      </w:r>
+    </w:p>
+    <w:p/>
+    <w:p>
+      <w:r>
+        <w:t>Quiero destacar la prolijidad de tu código.</w:t>
       </w:r>
     </w:p>
     <w:p/>
@@ -4100,13 +3959,7 @@
     <w:p/>
     <w:p>
       <w:r>
-        <w:t>Tu nota en el Desafío 0</w:t>
-      </w:r>
-      <w:r>
-        <w:t>4</w:t>
-      </w:r>
-      <w:r>
-        <w:t xml:space="preserve"> es: </w:t>
+        <w:t xml:space="preserve">Tu nota en el Desafío 05 es: </w:t>
       </w:r>
       <w:r>
         <w:rPr>
@@ -4210,7 +4063,6 @@
     <w:p/>
     <w:p>
       <w:r>
-        <w:lastRenderedPageBreak/>
         <w:t xml:space="preserve">En la parte del banner para que quede como en las imágenes de referencias iría </w:t>
       </w:r>
       <w:proofErr w:type="spellStart"/>
@@ -5104,6 +4956,7 @@
   <w:style w:type="character" w:default="1" w:styleId="Fuentedeprrafopredeter">
     <w:name w:val="Default Paragraph Font"/>
     <w:uiPriority w:val="1"/>
+    <w:semiHidden/>
     <w:unhideWhenUsed/>
   </w:style>
   <w:style w:type="table" w:default="1" w:styleId="Tablanormal">

</xml_diff>